<commit_message>
feat(docs): step 15 — cable journal rewrite (ГОСТ 21.613)
- Колонки: №КЛ | Марка | Жилы×Сечение | Откуда | Куда |
  L план | L расч | Прокладка | АВ,А | ΔU,% | Примечание
- length_m_plan / length_m_calc — раздельно по чертежу и с запасом
- Группировка по разделам (ЭОМ/ОВ/ВК/НО и др.)
- Номера КЛ из project["cable_numbering"] (КЛ-ЩО1-01 и т.д.)
- Резервные потребители отмечены в примечании
- Наружные сети из _results.outdoor_networks
- Итоговая строка: кол. линий, Σ план, Σ расч
- Штамп (Разработал/Проверил/Н.контроль/ГИП)
- TXT fallback без python-docx

https://claude.ai/code/session_01EUXh9NoaZ7HpixNuaMKahR
</commit_message>
<xml_diff>
--- a/elec-system/projects/DEMO-2025-001_Офисный_центр/docs/DEMO-2025-001_cable_journal.docx
+++ b/elec-system/projects/DEMO-2025-001_Офисный_центр/docs/DEMO-2025-001_cable_journal.docx
@@ -12,7 +12,7 @@
           <w:b/>
           <w:sz w:val="26"/>
         </w:rPr>
-        <w:t>Кабельный журнал</w:t>
+        <w:t>КАБЕЛЬНЫЙ ЖУРНАЛ</w:t>
       </w:r>
     </w:p>
     <w:p>
@@ -22,9 +22,23 @@
       <w:r>
         <w:rPr>
           <w:rFonts w:ascii="Times New Roman" w:hAnsi="Times New Roman"/>
+          <w:b w:val="0"/>
+          <w:sz w:val="22"/>
+        </w:rPr>
+        <w:t>Офисный центр</w:t>
+      </w:r>
+    </w:p>
+    <w:p>
+      <w:pPr>
+        <w:jc w:val="center"/>
+      </w:pPr>
+      <w:r>
+        <w:rPr>
+          <w:rFonts w:ascii="Times New Roman" w:hAnsi="Times New Roman"/>
+          <w:b w:val="0"/>
           <w:sz w:val="20"/>
         </w:rPr>
-        <w:t>Офисный центр | Код: DEMO-2025-001 | Стадия: Р | Ред.: 0 | Дата: 2025-04-18</w:t>
+        <w:t>Код: DEMO-2025-001  |  Стадия: Р  |  Ред.: 0  |  Дата: 2025-04-18</w:t>
       </w:r>
     </w:p>
     <w:p/>
@@ -32,23 +46,27 @@
       <w:tblPr>
         <w:tblStyle w:val="TableGrid"/>
         <w:tblW w:type="auto" w:w="0"/>
+        <w:jc w:val="center"/>
         <w:tblLook w:firstColumn="1" w:firstRow="1" w:lastColumn="0" w:lastRow="0" w:noHBand="0" w:noVBand="1" w:val="04A0"/>
       </w:tblPr>
       <w:tblGrid>
-        <w:gridCol w:w="2457"/>
-        <w:gridCol w:w="2457"/>
-        <w:gridCol w:w="2457"/>
-        <w:gridCol w:w="2457"/>
-        <w:gridCol w:w="2457"/>
-        <w:gridCol w:w="2457"/>
-        <w:gridCol w:w="2457"/>
-        <w:gridCol w:w="2457"/>
-        <w:gridCol w:w="2457"/>
+        <w:gridCol w:w="1842"/>
+        <w:gridCol w:w="1842"/>
+        <w:gridCol w:w="1842"/>
+        <w:gridCol w:w="1842"/>
+        <w:gridCol w:w="1842"/>
+        <w:gridCol w:w="1842"/>
+        <w:gridCol w:w="1842"/>
+        <w:gridCol w:w="1842"/>
+        <w:gridCol w:w="1842"/>
+        <w:gridCol w:w="1842"/>
+        <w:gridCol w:w="1842"/>
+        <w:gridCol w:w="1842"/>
       </w:tblGrid>
       <w:tr>
         <w:tc>
           <w:tcPr>
-            <w:tcW w:type="dxa" w:w="454"/>
+            <w:tcW w:type="dxa" w:w="397"/>
             <w:vAlign w:val="center"/>
           </w:tcPr>
           <w:p>
@@ -67,7 +85,26 @@
         </w:tc>
         <w:tc>
           <w:tcPr>
-            <w:tcW w:type="dxa" w:w="1984"/>
+            <w:tcW w:type="dxa" w:w="1417"/>
+            <w:vAlign w:val="center"/>
+          </w:tcPr>
+          <w:p>
+            <w:pPr>
+              <w:jc w:val="center"/>
+            </w:pPr>
+            <w:r>
+              <w:rPr>
+                <w:rFonts w:ascii="Times New Roman" w:hAnsi="Times New Roman"/>
+                <w:b/>
+                <w:sz w:val="18"/>
+              </w:rPr>
+              <w:t>№ КЛ</w:t>
+            </w:r>
+          </w:p>
+        </w:tc>
+        <w:tc>
+          <w:tcPr>
+            <w:tcW w:type="dxa" w:w="1814"/>
             <w:vAlign w:val="center"/>
           </w:tcPr>
           <w:p>
@@ -99,32 +136,13 @@
                 <w:b/>
                 <w:sz w:val="18"/>
               </w:rPr>
-              <w:t>Сечение, мм²</w:t>
+              <w:t>Жилы×Сечение</w:t>
             </w:r>
           </w:p>
         </w:tc>
         <w:tc>
           <w:tcPr>
-            <w:tcW w:type="dxa" w:w="680"/>
-            <w:vAlign w:val="center"/>
-          </w:tcPr>
-          <w:p>
-            <w:pPr>
-              <w:jc w:val="center"/>
-            </w:pPr>
-            <w:r>
-              <w:rPr>
-                <w:rFonts w:ascii="Times New Roman" w:hAnsi="Times New Roman"/>
-                <w:b/>
-                <w:sz w:val="18"/>
-              </w:rPr>
-              <w:t>Жил</w:t>
-            </w:r>
-          </w:p>
-        </w:tc>
-        <w:tc>
-          <w:tcPr>
-            <w:tcW w:type="dxa" w:w="1701"/>
+            <w:tcW w:type="dxa" w:w="1984"/>
             <w:vAlign w:val="center"/>
           </w:tcPr>
           <w:p>
@@ -143,7 +161,7 @@
         </w:tc>
         <w:tc>
           <w:tcPr>
-            <w:tcW w:type="dxa" w:w="1701"/>
+            <w:tcW w:type="dxa" w:w="3118"/>
             <w:vAlign w:val="center"/>
           </w:tcPr>
           <w:p>
@@ -175,13 +193,13 @@
                 <w:b/>
                 <w:sz w:val="18"/>
               </w:rPr>
-              <w:t>Длина, м</w:t>
+              <w:t>L план, м</w:t>
             </w:r>
           </w:p>
         </w:tc>
         <w:tc>
           <w:tcPr>
-            <w:tcW w:type="dxa" w:w="1984"/>
+            <w:tcW w:type="dxa" w:w="1134"/>
             <w:vAlign w:val="center"/>
           </w:tcPr>
           <w:p>
@@ -194,13 +212,70 @@
                 <w:b/>
                 <w:sz w:val="18"/>
               </w:rPr>
-              <w:t>Способ прокладки</w:t>
+              <w:t>L расч., м</w:t>
             </w:r>
           </w:p>
         </w:tc>
         <w:tc>
           <w:tcPr>
-            <w:tcW w:type="dxa" w:w="2835"/>
+            <w:tcW w:type="dxa" w:w="1701"/>
+            <w:vAlign w:val="center"/>
+          </w:tcPr>
+          <w:p>
+            <w:pPr>
+              <w:jc w:val="center"/>
+            </w:pPr>
+            <w:r>
+              <w:rPr>
+                <w:rFonts w:ascii="Times New Roman" w:hAnsi="Times New Roman"/>
+                <w:b/>
+                <w:sz w:val="18"/>
+              </w:rPr>
+              <w:t>Прокладка</w:t>
+            </w:r>
+          </w:p>
+        </w:tc>
+        <w:tc>
+          <w:tcPr>
+            <w:tcW w:type="dxa" w:w="850"/>
+            <w:vAlign w:val="center"/>
+          </w:tcPr>
+          <w:p>
+            <w:pPr>
+              <w:jc w:val="center"/>
+            </w:pPr>
+            <w:r>
+              <w:rPr>
+                <w:rFonts w:ascii="Times New Roman" w:hAnsi="Times New Roman"/>
+                <w:b/>
+                <w:sz w:val="18"/>
+              </w:rPr>
+              <w:t>АВ, А</w:t>
+            </w:r>
+          </w:p>
+        </w:tc>
+        <w:tc>
+          <w:tcPr>
+            <w:tcW w:type="dxa" w:w="850"/>
+            <w:vAlign w:val="center"/>
+          </w:tcPr>
+          <w:p>
+            <w:pPr>
+              <w:jc w:val="center"/>
+            </w:pPr>
+            <w:r>
+              <w:rPr>
+                <w:rFonts w:ascii="Times New Roman" w:hAnsi="Times New Roman"/>
+                <w:b/>
+                <w:sz w:val="18"/>
+              </w:rPr>
+              <w:t>ΔU, %</w:t>
+            </w:r>
+          </w:p>
+        </w:tc>
+        <w:tc>
+          <w:tcPr>
+            <w:tcW w:type="dxa" w:w="2268"/>
             <w:vAlign w:val="center"/>
           </w:tcPr>
           <w:p>
@@ -221,7 +296,28 @@
       <w:tr>
         <w:tc>
           <w:tcPr>
-            <w:tcW w:type="dxa" w:w="454"/>
+            <w:tcW w:type="dxa" w:w="22104"/>
+            <w:gridSpan w:val="12"/>
+          </w:tcPr>
+          <w:p>
+            <w:pPr>
+              <w:jc w:val="left"/>
+            </w:pPr>
+            <w:r>
+              <w:rPr>
+                <w:rFonts w:ascii="Times New Roman" w:hAnsi="Times New Roman"/>
+                <w:b/>
+                <w:sz w:val="18"/>
+              </w:rPr>
+              <w:t xml:space="preserve">  Раздел: ЭОМ</w:t>
+            </w:r>
+          </w:p>
+        </w:tc>
+      </w:tr>
+      <w:tr>
+        <w:tc>
+          <w:tcPr>
+            <w:tcW w:type="dxa" w:w="397"/>
           </w:tcPr>
           <w:p>
             <w:pPr>
@@ -230,6 +326,7 @@
             <w:r>
               <w:rPr>
                 <w:rFonts w:ascii="Times New Roman" w:hAnsi="Times New Roman"/>
+                <w:b w:val="0"/>
                 <w:sz w:val="18"/>
               </w:rPr>
               <w:t>1</w:t>
@@ -238,7 +335,7 @@
         </w:tc>
         <w:tc>
           <w:tcPr>
-            <w:tcW w:type="dxa" w:w="1984"/>
+            <w:tcW w:type="dxa" w:w="1417"/>
           </w:tcPr>
           <w:p>
             <w:pPr>
@@ -247,6 +344,25 @@
             <w:r>
               <w:rPr>
                 <w:rFonts w:ascii="Times New Roman" w:hAnsi="Times New Roman"/>
+                <w:b w:val="0"/>
+                <w:sz w:val="18"/>
+              </w:rPr>
+              <w:t>—</w:t>
+            </w:r>
+          </w:p>
+        </w:tc>
+        <w:tc>
+          <w:tcPr>
+            <w:tcW w:type="dxa" w:w="1814"/>
+          </w:tcPr>
+          <w:p>
+            <w:pPr>
+              <w:jc w:val="left"/>
+            </w:pPr>
+            <w:r>
+              <w:rPr>
+                <w:rFonts w:ascii="Times New Roman" w:hAnsi="Times New Roman"/>
+                <w:b w:val="0"/>
                 <w:sz w:val="18"/>
               </w:rPr>
               <w:t>ВВГнг-LS</w:t>
@@ -264,15 +380,16 @@
             <w:r>
               <w:rPr>
                 <w:rFonts w:ascii="Times New Roman" w:hAnsi="Times New Roman"/>
+                <w:b w:val="0"/>
                 <w:sz w:val="18"/>
               </w:rPr>
-              <w:t>10</w:t>
+              <w:t>4×25</w:t>
             </w:r>
           </w:p>
         </w:tc>
         <w:tc>
           <w:tcPr>
-            <w:tcW w:type="dxa" w:w="680"/>
+            <w:tcW w:type="dxa" w:w="1984"/>
           </w:tcPr>
           <w:p>
             <w:pPr>
@@ -281,23 +398,7 @@
             <w:r>
               <w:rPr>
                 <w:rFonts w:ascii="Times New Roman" w:hAnsi="Times New Roman"/>
-                <w:sz w:val="18"/>
-              </w:rPr>
-              <w:t>4</w:t>
-            </w:r>
-          </w:p>
-        </w:tc>
-        <w:tc>
-          <w:tcPr>
-            <w:tcW w:type="dxa" w:w="1701"/>
-          </w:tcPr>
-          <w:p>
-            <w:pPr>
-              <w:jc w:val="center"/>
-            </w:pPr>
-            <w:r>
-              <w:rPr>
-                <w:rFonts w:ascii="Times New Roman" w:hAnsi="Times New Roman"/>
+                <w:b w:val="0"/>
                 <w:sz w:val="18"/>
               </w:rPr>
               <w:t>ТП-1</w:t>
@@ -306,15 +407,16 @@
         </w:tc>
         <w:tc>
           <w:tcPr>
-            <w:tcW w:type="dxa" w:w="1701"/>
+            <w:tcW w:type="dxa" w:w="3118"/>
           </w:tcPr>
           <w:p>
             <w:pPr>
-              <w:jc w:val="center"/>
+              <w:jc w:val="left"/>
             </w:pPr>
             <w:r>
               <w:rPr>
                 <w:rFonts w:ascii="Times New Roman" w:hAnsi="Times New Roman"/>
+                <w:b w:val="0"/>
                 <w:sz w:val="18"/>
               </w:rPr>
               <w:t>ВРУ-1</w:t>
@@ -332,6 +434,7 @@
             <w:r>
               <w:rPr>
                 <w:rFonts w:ascii="Times New Roman" w:hAnsi="Times New Roman"/>
+                <w:b w:val="0"/>
                 <w:sz w:val="18"/>
               </w:rPr>
               <w:t>30</w:t>
@@ -340,7 +443,7 @@
         </w:tc>
         <w:tc>
           <w:tcPr>
-            <w:tcW w:type="dxa" w:w="1984"/>
+            <w:tcW w:type="dxa" w:w="1134"/>
           </w:tcPr>
           <w:p>
             <w:pPr>
@@ -349,6 +452,25 @@
             <w:r>
               <w:rPr>
                 <w:rFonts w:ascii="Times New Roman" w:hAnsi="Times New Roman"/>
+                <w:b w:val="0"/>
+                <w:sz w:val="18"/>
+              </w:rPr>
+              <w:t>30</w:t>
+            </w:r>
+          </w:p>
+        </w:tc>
+        <w:tc>
+          <w:tcPr>
+            <w:tcW w:type="dxa" w:w="1701"/>
+          </w:tcPr>
+          <w:p>
+            <w:pPr>
+              <w:jc w:val="left"/>
+            </w:pPr>
+            <w:r>
+              <w:rPr>
+                <w:rFonts w:ascii="Times New Roman" w:hAnsi="Times New Roman"/>
+                <w:b w:val="0"/>
                 <w:sz w:val="18"/>
               </w:rPr>
               <w:t>лоток</w:t>
@@ -357,7 +479,7 @@
         </w:tc>
         <w:tc>
           <w:tcPr>
-            <w:tcW w:type="dxa" w:w="2835"/>
+            <w:tcW w:type="dxa" w:w="850"/>
           </w:tcPr>
           <w:p>
             <w:pPr>
@@ -366,17 +488,16 @@
             <w:r>
               <w:rPr>
                 <w:rFonts w:ascii="Times New Roman" w:hAnsi="Times New Roman"/>
+                <w:b w:val="0"/>
                 <w:sz w:val="18"/>
               </w:rPr>
-              <w:t>Iдоп=55А</w:t>
+              <w:t>80</w:t>
             </w:r>
           </w:p>
         </w:tc>
-      </w:tr>
-      <w:tr>
         <w:tc>
           <w:tcPr>
-            <w:tcW w:type="dxa" w:w="454"/>
+            <w:tcW w:type="dxa" w:w="850"/>
           </w:tcPr>
           <w:p>
             <w:pPr>
@@ -385,6 +506,65 @@
             <w:r>
               <w:rPr>
                 <w:rFonts w:ascii="Times New Roman" w:hAnsi="Times New Roman"/>
+                <w:b w:val="0"/>
+                <w:sz w:val="18"/>
+              </w:rPr>
+              <w:t>—</w:t>
+            </w:r>
+          </w:p>
+        </w:tc>
+        <w:tc>
+          <w:tcPr>
+            <w:tcW w:type="dxa" w:w="2268"/>
+          </w:tcPr>
+          <w:p>
+            <w:pPr>
+              <w:jc w:val="left"/>
+            </w:pPr>
+            <w:r>
+              <w:rPr>
+                <w:rFonts w:ascii="Times New Roman" w:hAnsi="Times New Roman"/>
+                <w:b w:val="0"/>
+                <w:sz w:val="18"/>
+              </w:rPr>
+            </w:r>
+          </w:p>
+        </w:tc>
+      </w:tr>
+      <w:tr>
+        <w:tc>
+          <w:tcPr>
+            <w:tcW w:type="dxa" w:w="22104"/>
+            <w:gridSpan w:val="12"/>
+          </w:tcPr>
+          <w:p>
+            <w:pPr>
+              <w:jc w:val="left"/>
+            </w:pPr>
+            <w:r>
+              <w:rPr>
+                <w:rFonts w:ascii="Times New Roman" w:hAnsi="Times New Roman"/>
+                <w:b/>
+                <w:sz w:val="18"/>
+              </w:rPr>
+              <w:t xml:space="preserve">  Раздел: Освещение</w:t>
+            </w:r>
+          </w:p>
+        </w:tc>
+      </w:tr>
+      <w:tr>
+        <w:tc>
+          <w:tcPr>
+            <w:tcW w:type="dxa" w:w="397"/>
+          </w:tcPr>
+          <w:p>
+            <w:pPr>
+              <w:jc w:val="center"/>
+            </w:pPr>
+            <w:r>
+              <w:rPr>
+                <w:rFonts w:ascii="Times New Roman" w:hAnsi="Times New Roman"/>
+                <w:b w:val="0"/>
                 <w:sz w:val="18"/>
               </w:rPr>
               <w:t>2</w:t>
@@ -393,7 +573,7 @@
         </w:tc>
         <w:tc>
           <w:tcPr>
-            <w:tcW w:type="dxa" w:w="1984"/>
+            <w:tcW w:type="dxa" w:w="1417"/>
           </w:tcPr>
           <w:p>
             <w:pPr>
@@ -402,6 +582,25 @@
             <w:r>
               <w:rPr>
                 <w:rFonts w:ascii="Times New Roman" w:hAnsi="Times New Roman"/>
+                <w:b w:val="0"/>
+                <w:sz w:val="18"/>
+              </w:rPr>
+              <w:t>—</w:t>
+            </w:r>
+          </w:p>
+        </w:tc>
+        <w:tc>
+          <w:tcPr>
+            <w:tcW w:type="dxa" w:w="1814"/>
+          </w:tcPr>
+          <w:p>
+            <w:pPr>
+              <w:jc w:val="left"/>
+            </w:pPr>
+            <w:r>
+              <w:rPr>
+                <w:rFonts w:ascii="Times New Roman" w:hAnsi="Times New Roman"/>
+                <w:b w:val="0"/>
                 <w:sz w:val="18"/>
               </w:rPr>
               <w:t>ВВГнг-LS</w:t>
@@ -419,15 +618,16 @@
             <w:r>
               <w:rPr>
                 <w:rFonts w:ascii="Times New Roman" w:hAnsi="Times New Roman"/>
+                <w:b w:val="0"/>
                 <w:sz w:val="18"/>
               </w:rPr>
-              <w:t>1.5</w:t>
+              <w:t>4×1.5</w:t>
             </w:r>
           </w:p>
         </w:tc>
         <w:tc>
           <w:tcPr>
-            <w:tcW w:type="dxa" w:w="680"/>
+            <w:tcW w:type="dxa" w:w="1984"/>
           </w:tcPr>
           <w:p>
             <w:pPr>
@@ -436,23 +636,7 @@
             <w:r>
               <w:rPr>
                 <w:rFonts w:ascii="Times New Roman" w:hAnsi="Times New Roman"/>
-                <w:sz w:val="18"/>
-              </w:rPr>
-              <w:t>4</w:t>
-            </w:r>
-          </w:p>
-        </w:tc>
-        <w:tc>
-          <w:tcPr>
-            <w:tcW w:type="dxa" w:w="1701"/>
-          </w:tcPr>
-          <w:p>
-            <w:pPr>
-              <w:jc w:val="center"/>
-            </w:pPr>
-            <w:r>
-              <w:rPr>
-                <w:rFonts w:ascii="Times New Roman" w:hAnsi="Times New Roman"/>
+                <w:b w:val="0"/>
                 <w:sz w:val="18"/>
               </w:rPr>
               <w:t>ВРУ-1</w:t>
@@ -461,18 +645,19 @@
         </w:tc>
         <w:tc>
           <w:tcPr>
-            <w:tcW w:type="dxa" w:w="1701"/>
+            <w:tcW w:type="dxa" w:w="3118"/>
           </w:tcPr>
           <w:p>
             <w:pPr>
-              <w:jc w:val="center"/>
+              <w:jc w:val="left"/>
             </w:pPr>
             <w:r>
               <w:rPr>
                 <w:rFonts w:ascii="Times New Roman" w:hAnsi="Times New Roman"/>
+                <w:b w:val="0"/>
                 <w:sz w:val="18"/>
               </w:rPr>
-              <w:t>ЩО-1</w:t>
+              <w:t>Щит освещения №1</w:t>
             </w:r>
           </w:p>
         </w:tc>
@@ -487,6 +672,7 @@
             <w:r>
               <w:rPr>
                 <w:rFonts w:ascii="Times New Roman" w:hAnsi="Times New Roman"/>
+                <w:b w:val="0"/>
                 <w:sz w:val="18"/>
               </w:rPr>
               <w:t>25</w:t>
@@ -495,7 +681,7 @@
         </w:tc>
         <w:tc>
           <w:tcPr>
-            <w:tcW w:type="dxa" w:w="1984"/>
+            <w:tcW w:type="dxa" w:w="1134"/>
           </w:tcPr>
           <w:p>
             <w:pPr>
@@ -504,6 +690,25 @@
             <w:r>
               <w:rPr>
                 <w:rFonts w:ascii="Times New Roman" w:hAnsi="Times New Roman"/>
+                <w:b w:val="0"/>
+                <w:sz w:val="18"/>
+              </w:rPr>
+              <w:t>25</w:t>
+            </w:r>
+          </w:p>
+        </w:tc>
+        <w:tc>
+          <w:tcPr>
+            <w:tcW w:type="dxa" w:w="1701"/>
+          </w:tcPr>
+          <w:p>
+            <w:pPr>
+              <w:jc w:val="left"/>
+            </w:pPr>
+            <w:r>
+              <w:rPr>
+                <w:rFonts w:ascii="Times New Roman" w:hAnsi="Times New Roman"/>
+                <w:b w:val="0"/>
                 <w:sz w:val="18"/>
               </w:rPr>
               <w:t>лоток</w:t>
@@ -512,7 +717,7 @@
         </w:tc>
         <w:tc>
           <w:tcPr>
-            <w:tcW w:type="dxa" w:w="2835"/>
+            <w:tcW w:type="dxa" w:w="850"/>
           </w:tcPr>
           <w:p>
             <w:pPr>
@@ -521,17 +726,16 @@
             <w:r>
               <w:rPr>
                 <w:rFonts w:ascii="Times New Roman" w:hAnsi="Times New Roman"/>
+                <w:b w:val="0"/>
                 <w:sz w:val="18"/>
               </w:rPr>
-              <w:t>ΔU=1.04%</w:t>
+              <w:t>10</w:t>
             </w:r>
           </w:p>
         </w:tc>
-      </w:tr>
-      <w:tr>
         <w:tc>
           <w:tcPr>
-            <w:tcW w:type="dxa" w:w="454"/>
+            <w:tcW w:type="dxa" w:w="850"/>
           </w:tcPr>
           <w:p>
             <w:pPr>
@@ -540,6 +744,44 @@
             <w:r>
               <w:rPr>
                 <w:rFonts w:ascii="Times New Roman" w:hAnsi="Times New Roman"/>
+                <w:b w:val="0"/>
+                <w:sz w:val="18"/>
+              </w:rPr>
+              <w:t>1.04</w:t>
+            </w:r>
+          </w:p>
+        </w:tc>
+        <w:tc>
+          <w:tcPr>
+            <w:tcW w:type="dxa" w:w="2268"/>
+          </w:tcPr>
+          <w:p>
+            <w:pPr>
+              <w:jc w:val="left"/>
+            </w:pPr>
+            <w:r>
+              <w:rPr>
+                <w:rFonts w:ascii="Times New Roman" w:hAnsi="Times New Roman"/>
+                <w:b w:val="0"/>
+                <w:sz w:val="18"/>
+              </w:rPr>
+            </w:r>
+          </w:p>
+        </w:tc>
+      </w:tr>
+      <w:tr>
+        <w:tc>
+          <w:tcPr>
+            <w:tcW w:type="dxa" w:w="397"/>
+          </w:tcPr>
+          <w:p>
+            <w:pPr>
+              <w:jc w:val="center"/>
+            </w:pPr>
+            <w:r>
+              <w:rPr>
+                <w:rFonts w:ascii="Times New Roman" w:hAnsi="Times New Roman"/>
+                <w:b w:val="0"/>
                 <w:sz w:val="18"/>
               </w:rPr>
               <w:t>3</w:t>
@@ -548,7 +790,7 @@
         </w:tc>
         <w:tc>
           <w:tcPr>
-            <w:tcW w:type="dxa" w:w="1984"/>
+            <w:tcW w:type="dxa" w:w="1417"/>
           </w:tcPr>
           <w:p>
             <w:pPr>
@@ -557,6 +799,25 @@
             <w:r>
               <w:rPr>
                 <w:rFonts w:ascii="Times New Roman" w:hAnsi="Times New Roman"/>
+                <w:b w:val="0"/>
+                <w:sz w:val="18"/>
+              </w:rPr>
+              <w:t>КЛ-ЩО1-01</w:t>
+            </w:r>
+          </w:p>
+        </w:tc>
+        <w:tc>
+          <w:tcPr>
+            <w:tcW w:type="dxa" w:w="1814"/>
+          </w:tcPr>
+          <w:p>
+            <w:pPr>
+              <w:jc w:val="left"/>
+            </w:pPr>
+            <w:r>
+              <w:rPr>
+                <w:rFonts w:ascii="Times New Roman" w:hAnsi="Times New Roman"/>
+                <w:b w:val="0"/>
                 <w:sz w:val="18"/>
               </w:rPr>
               <w:t>ВВГнг-LS</w:t>
@@ -574,15 +835,16 @@
             <w:r>
               <w:rPr>
                 <w:rFonts w:ascii="Times New Roman" w:hAnsi="Times New Roman"/>
+                <w:b w:val="0"/>
                 <w:sz w:val="18"/>
               </w:rPr>
-              <w:t>1.5</w:t>
+              <w:t>3×1.5</w:t>
             </w:r>
           </w:p>
         </w:tc>
         <w:tc>
           <w:tcPr>
-            <w:tcW w:type="dxa" w:w="680"/>
+            <w:tcW w:type="dxa" w:w="1984"/>
           </w:tcPr>
           <w:p>
             <w:pPr>
@@ -591,23 +853,7 @@
             <w:r>
               <w:rPr>
                 <w:rFonts w:ascii="Times New Roman" w:hAnsi="Times New Roman"/>
-                <w:sz w:val="18"/>
-              </w:rPr>
-              <w:t>3</w:t>
-            </w:r>
-          </w:p>
-        </w:tc>
-        <w:tc>
-          <w:tcPr>
-            <w:tcW w:type="dxa" w:w="1701"/>
-          </w:tcPr>
-          <w:p>
-            <w:pPr>
-              <w:jc w:val="center"/>
-            </w:pPr>
-            <w:r>
-              <w:rPr>
-                <w:rFonts w:ascii="Times New Roman" w:hAnsi="Times New Roman"/>
+                <w:b w:val="0"/>
                 <w:sz w:val="18"/>
               </w:rPr>
               <w:t>ЩО-1</w:t>
@@ -616,18 +862,19 @@
         </w:tc>
         <w:tc>
           <w:tcPr>
-            <w:tcW w:type="dxa" w:w="1701"/>
+            <w:tcW w:type="dxa" w:w="3118"/>
           </w:tcPr>
           <w:p>
             <w:pPr>
-              <w:jc w:val="center"/>
+              <w:jc w:val="left"/>
             </w:pPr>
             <w:r>
               <w:rPr>
                 <w:rFonts w:ascii="Times New Roman" w:hAnsi="Times New Roman"/>
+                <w:b w:val="0"/>
                 <w:sz w:val="18"/>
               </w:rPr>
-              <w:t>ОС-01</w:t>
+              <w:t>Освещение офисов</w:t>
             </w:r>
           </w:p>
         </w:tc>
@@ -642,6 +889,7 @@
             <w:r>
               <w:rPr>
                 <w:rFonts w:ascii="Times New Roman" w:hAnsi="Times New Roman"/>
+                <w:b w:val="0"/>
                 <w:sz w:val="18"/>
               </w:rPr>
               <w:t>30</w:t>
@@ -650,7 +898,7 @@
         </w:tc>
         <w:tc>
           <w:tcPr>
-            <w:tcW w:type="dxa" w:w="1984"/>
+            <w:tcW w:type="dxa" w:w="1134"/>
           </w:tcPr>
           <w:p>
             <w:pPr>
@@ -659,6 +907,25 @@
             <w:r>
               <w:rPr>
                 <w:rFonts w:ascii="Times New Roman" w:hAnsi="Times New Roman"/>
+                <w:b w:val="0"/>
+                <w:sz w:val="18"/>
+              </w:rPr>
+              <w:t>36</w:t>
+            </w:r>
+          </w:p>
+        </w:tc>
+        <w:tc>
+          <w:tcPr>
+            <w:tcW w:type="dxa" w:w="1701"/>
+          </w:tcPr>
+          <w:p>
+            <w:pPr>
+              <w:jc w:val="left"/>
+            </w:pPr>
+            <w:r>
+              <w:rPr>
+                <w:rFonts w:ascii="Times New Roman" w:hAnsi="Times New Roman"/>
+                <w:b w:val="0"/>
                 <w:sz w:val="18"/>
               </w:rPr>
               <w:t>лоток</w:t>
@@ -667,7 +934,7 @@
         </w:tc>
         <w:tc>
           <w:tcPr>
-            <w:tcW w:type="dxa" w:w="2835"/>
+            <w:tcW w:type="dxa" w:w="850"/>
           </w:tcPr>
           <w:p>
             <w:pPr>
@@ -676,17 +943,16 @@
             <w:r>
               <w:rPr>
                 <w:rFonts w:ascii="Times New Roman" w:hAnsi="Times New Roman"/>
+                <w:b w:val="0"/>
                 <w:sz w:val="18"/>
               </w:rPr>
-              <w:t>Освещение офисов</w:t>
+              <w:t>6</w:t>
             </w:r>
           </w:p>
         </w:tc>
-      </w:tr>
-      <w:tr>
         <w:tc>
           <w:tcPr>
-            <w:tcW w:type="dxa" w:w="454"/>
+            <w:tcW w:type="dxa" w:w="850"/>
           </w:tcPr>
           <w:p>
             <w:pPr>
@@ -695,6 +961,45 @@
             <w:r>
               <w:rPr>
                 <w:rFonts w:ascii="Times New Roman" w:hAnsi="Times New Roman"/>
+                <w:b w:val="0"/>
+                <w:sz w:val="18"/>
+              </w:rPr>
+              <w:t>0.90</w:t>
+            </w:r>
+          </w:p>
+        </w:tc>
+        <w:tc>
+          <w:tcPr>
+            <w:tcW w:type="dxa" w:w="2268"/>
+          </w:tcPr>
+          <w:p>
+            <w:pPr>
+              <w:jc w:val="left"/>
+            </w:pPr>
+            <w:r>
+              <w:rPr>
+                <w:rFonts w:ascii="Times New Roman" w:hAnsi="Times New Roman"/>
+                <w:b w:val="0"/>
+                <w:sz w:val="18"/>
+              </w:rPr>
+              <w:t>план 30м + запас 20%</w:t>
+            </w:r>
+          </w:p>
+        </w:tc>
+      </w:tr>
+      <w:tr>
+        <w:tc>
+          <w:tcPr>
+            <w:tcW w:type="dxa" w:w="397"/>
+          </w:tcPr>
+          <w:p>
+            <w:pPr>
+              <w:jc w:val="center"/>
+            </w:pPr>
+            <w:r>
+              <w:rPr>
+                <w:rFonts w:ascii="Times New Roman" w:hAnsi="Times New Roman"/>
+                <w:b w:val="0"/>
                 <w:sz w:val="18"/>
               </w:rPr>
               <w:t>4</w:t>
@@ -703,7 +1008,7 @@
         </w:tc>
         <w:tc>
           <w:tcPr>
-            <w:tcW w:type="dxa" w:w="1984"/>
+            <w:tcW w:type="dxa" w:w="1417"/>
           </w:tcPr>
           <w:p>
             <w:pPr>
@@ -712,6 +1017,25 @@
             <w:r>
               <w:rPr>
                 <w:rFonts w:ascii="Times New Roman" w:hAnsi="Times New Roman"/>
+                <w:b w:val="0"/>
+                <w:sz w:val="18"/>
+              </w:rPr>
+              <w:t>КЛ-ЩО1-02</w:t>
+            </w:r>
+          </w:p>
+        </w:tc>
+        <w:tc>
+          <w:tcPr>
+            <w:tcW w:type="dxa" w:w="1814"/>
+          </w:tcPr>
+          <w:p>
+            <w:pPr>
+              <w:jc w:val="left"/>
+            </w:pPr>
+            <w:r>
+              <w:rPr>
+                <w:rFonts w:ascii="Times New Roman" w:hAnsi="Times New Roman"/>
+                <w:b w:val="0"/>
                 <w:sz w:val="18"/>
               </w:rPr>
               <w:t>ВВГнг-LS</w:t>
@@ -729,15 +1053,16 @@
             <w:r>
               <w:rPr>
                 <w:rFonts w:ascii="Times New Roman" w:hAnsi="Times New Roman"/>
+                <w:b w:val="0"/>
                 <w:sz w:val="18"/>
               </w:rPr>
-              <w:t>1.5</w:t>
+              <w:t>3×1.5</w:t>
             </w:r>
           </w:p>
         </w:tc>
         <w:tc>
           <w:tcPr>
-            <w:tcW w:type="dxa" w:w="680"/>
+            <w:tcW w:type="dxa" w:w="1984"/>
           </w:tcPr>
           <w:p>
             <w:pPr>
@@ -746,23 +1071,7 @@
             <w:r>
               <w:rPr>
                 <w:rFonts w:ascii="Times New Roman" w:hAnsi="Times New Roman"/>
-                <w:sz w:val="18"/>
-              </w:rPr>
-              <w:t>3</w:t>
-            </w:r>
-          </w:p>
-        </w:tc>
-        <w:tc>
-          <w:tcPr>
-            <w:tcW w:type="dxa" w:w="1701"/>
-          </w:tcPr>
-          <w:p>
-            <w:pPr>
-              <w:jc w:val="center"/>
-            </w:pPr>
-            <w:r>
-              <w:rPr>
-                <w:rFonts w:ascii="Times New Roman" w:hAnsi="Times New Roman"/>
+                <w:b w:val="0"/>
                 <w:sz w:val="18"/>
               </w:rPr>
               <w:t>ЩО-1</w:t>
@@ -771,18 +1080,19 @@
         </w:tc>
         <w:tc>
           <w:tcPr>
-            <w:tcW w:type="dxa" w:w="1701"/>
+            <w:tcW w:type="dxa" w:w="3118"/>
           </w:tcPr>
           <w:p>
             <w:pPr>
-              <w:jc w:val="center"/>
+              <w:jc w:val="left"/>
             </w:pPr>
             <w:r>
               <w:rPr>
                 <w:rFonts w:ascii="Times New Roman" w:hAnsi="Times New Roman"/>
+                <w:b w:val="0"/>
                 <w:sz w:val="18"/>
               </w:rPr>
-              <w:t>ОС-02</w:t>
+              <w:t>Освещение коридоров и холлов</w:t>
             </w:r>
           </w:p>
         </w:tc>
@@ -797,6 +1107,7 @@
             <w:r>
               <w:rPr>
                 <w:rFonts w:ascii="Times New Roman" w:hAnsi="Times New Roman"/>
+                <w:b w:val="0"/>
                 <w:sz w:val="18"/>
               </w:rPr>
               <w:t>25</w:t>
@@ -805,7 +1116,7 @@
         </w:tc>
         <w:tc>
           <w:tcPr>
-            <w:tcW w:type="dxa" w:w="1984"/>
+            <w:tcW w:type="dxa" w:w="1134"/>
           </w:tcPr>
           <w:p>
             <w:pPr>
@@ -814,6 +1125,25 @@
             <w:r>
               <w:rPr>
                 <w:rFonts w:ascii="Times New Roman" w:hAnsi="Times New Roman"/>
+                <w:b w:val="0"/>
+                <w:sz w:val="18"/>
+              </w:rPr>
+              <w:t>30</w:t>
+            </w:r>
+          </w:p>
+        </w:tc>
+        <w:tc>
+          <w:tcPr>
+            <w:tcW w:type="dxa" w:w="1701"/>
+          </w:tcPr>
+          <w:p>
+            <w:pPr>
+              <w:jc w:val="left"/>
+            </w:pPr>
+            <w:r>
+              <w:rPr>
+                <w:rFonts w:ascii="Times New Roman" w:hAnsi="Times New Roman"/>
+                <w:b w:val="0"/>
                 <w:sz w:val="18"/>
               </w:rPr>
               <w:t>лоток</w:t>
@@ -822,7 +1152,7 @@
         </w:tc>
         <w:tc>
           <w:tcPr>
-            <w:tcW w:type="dxa" w:w="2835"/>
+            <w:tcW w:type="dxa" w:w="850"/>
           </w:tcPr>
           <w:p>
             <w:pPr>
@@ -831,17 +1161,16 @@
             <w:r>
               <w:rPr>
                 <w:rFonts w:ascii="Times New Roman" w:hAnsi="Times New Roman"/>
+                <w:b w:val="0"/>
                 <w:sz w:val="18"/>
               </w:rPr>
-              <w:t>Освещение коридоров и холлов</w:t>
+              <w:t>6</w:t>
             </w:r>
           </w:p>
         </w:tc>
-      </w:tr>
-      <w:tr>
         <w:tc>
           <w:tcPr>
-            <w:tcW w:type="dxa" w:w="454"/>
+            <w:tcW w:type="dxa" w:w="850"/>
           </w:tcPr>
           <w:p>
             <w:pPr>
@@ -850,6 +1179,66 @@
             <w:r>
               <w:rPr>
                 <w:rFonts w:ascii="Times New Roman" w:hAnsi="Times New Roman"/>
+                <w:b w:val="0"/>
+                <w:sz w:val="18"/>
+              </w:rPr>
+              <w:t>0.50</w:t>
+            </w:r>
+          </w:p>
+        </w:tc>
+        <w:tc>
+          <w:tcPr>
+            <w:tcW w:type="dxa" w:w="2268"/>
+          </w:tcPr>
+          <w:p>
+            <w:pPr>
+              <w:jc w:val="left"/>
+            </w:pPr>
+            <w:r>
+              <w:rPr>
+                <w:rFonts w:ascii="Times New Roman" w:hAnsi="Times New Roman"/>
+                <w:b w:val="0"/>
+                <w:sz w:val="18"/>
+              </w:rPr>
+              <w:t>план 25м + запас 20%</w:t>
+            </w:r>
+          </w:p>
+        </w:tc>
+      </w:tr>
+      <w:tr>
+        <w:tc>
+          <w:tcPr>
+            <w:tcW w:type="dxa" w:w="22104"/>
+            <w:gridSpan w:val="12"/>
+          </w:tcPr>
+          <w:p>
+            <w:pPr>
+              <w:jc w:val="left"/>
+            </w:pPr>
+            <w:r>
+              <w:rPr>
+                <w:rFonts w:ascii="Times New Roman" w:hAnsi="Times New Roman"/>
+                <w:b/>
+                <w:sz w:val="18"/>
+              </w:rPr>
+              <w:t xml:space="preserve">  Раздел: Силовые сети</w:t>
+            </w:r>
+          </w:p>
+        </w:tc>
+      </w:tr>
+      <w:tr>
+        <w:tc>
+          <w:tcPr>
+            <w:tcW w:type="dxa" w:w="397"/>
+          </w:tcPr>
+          <w:p>
+            <w:pPr>
+              <w:jc w:val="center"/>
+            </w:pPr>
+            <w:r>
+              <w:rPr>
+                <w:rFonts w:ascii="Times New Roman" w:hAnsi="Times New Roman"/>
+                <w:b w:val="0"/>
                 <w:sz w:val="18"/>
               </w:rPr>
               <w:t>5</w:t>
@@ -858,7 +1247,7 @@
         </w:tc>
         <w:tc>
           <w:tcPr>
-            <w:tcW w:type="dxa" w:w="1984"/>
+            <w:tcW w:type="dxa" w:w="1417"/>
           </w:tcPr>
           <w:p>
             <w:pPr>
@@ -867,6 +1256,25 @@
             <w:r>
               <w:rPr>
                 <w:rFonts w:ascii="Times New Roman" w:hAnsi="Times New Roman"/>
+                <w:b w:val="0"/>
+                <w:sz w:val="18"/>
+              </w:rPr>
+              <w:t>—</w:t>
+            </w:r>
+          </w:p>
+        </w:tc>
+        <w:tc>
+          <w:tcPr>
+            <w:tcW w:type="dxa" w:w="1814"/>
+          </w:tcPr>
+          <w:p>
+            <w:pPr>
+              <w:jc w:val="left"/>
+            </w:pPr>
+            <w:r>
+              <w:rPr>
+                <w:rFonts w:ascii="Times New Roman" w:hAnsi="Times New Roman"/>
+                <w:b w:val="0"/>
                 <w:sz w:val="18"/>
               </w:rPr>
               <w:t>ВВГнг-LS</w:t>
@@ -884,15 +1292,16 @@
             <w:r>
               <w:rPr>
                 <w:rFonts w:ascii="Times New Roman" w:hAnsi="Times New Roman"/>
+                <w:b w:val="0"/>
                 <w:sz w:val="18"/>
               </w:rPr>
-              <w:t>1.5</w:t>
+              <w:t>4×1.5</w:t>
             </w:r>
           </w:p>
         </w:tc>
         <w:tc>
           <w:tcPr>
-            <w:tcW w:type="dxa" w:w="680"/>
+            <w:tcW w:type="dxa" w:w="1984"/>
           </w:tcPr>
           <w:p>
             <w:pPr>
@@ -901,23 +1310,7 @@
             <w:r>
               <w:rPr>
                 <w:rFonts w:ascii="Times New Roman" w:hAnsi="Times New Roman"/>
-                <w:sz w:val="18"/>
-              </w:rPr>
-              <w:t>4</w:t>
-            </w:r>
-          </w:p>
-        </w:tc>
-        <w:tc>
-          <w:tcPr>
-            <w:tcW w:type="dxa" w:w="1701"/>
-          </w:tcPr>
-          <w:p>
-            <w:pPr>
-              <w:jc w:val="center"/>
-            </w:pPr>
-            <w:r>
-              <w:rPr>
-                <w:rFonts w:ascii="Times New Roman" w:hAnsi="Times New Roman"/>
+                <w:b w:val="0"/>
                 <w:sz w:val="18"/>
               </w:rPr>
               <w:t>ВРУ-1</w:t>
@@ -926,18 +1319,19 @@
         </w:tc>
         <w:tc>
           <w:tcPr>
-            <w:tcW w:type="dxa" w:w="1701"/>
+            <w:tcW w:type="dxa" w:w="3118"/>
           </w:tcPr>
           <w:p>
             <w:pPr>
-              <w:jc w:val="center"/>
+              <w:jc w:val="left"/>
             </w:pPr>
             <w:r>
               <w:rPr>
                 <w:rFonts w:ascii="Times New Roman" w:hAnsi="Times New Roman"/>
+                <w:b w:val="0"/>
                 <w:sz w:val="18"/>
               </w:rPr>
-              <w:t>ЩС-1</w:t>
+              <w:t>Щит силовой №1</w:t>
             </w:r>
           </w:p>
         </w:tc>
@@ -952,6 +1346,7 @@
             <w:r>
               <w:rPr>
                 <w:rFonts w:ascii="Times New Roman" w:hAnsi="Times New Roman"/>
+                <w:b w:val="0"/>
                 <w:sz w:val="18"/>
               </w:rPr>
               <w:t>30</w:t>
@@ -960,7 +1355,7 @@
         </w:tc>
         <w:tc>
           <w:tcPr>
-            <w:tcW w:type="dxa" w:w="1984"/>
+            <w:tcW w:type="dxa" w:w="1134"/>
           </w:tcPr>
           <w:p>
             <w:pPr>
@@ -969,6 +1364,25 @@
             <w:r>
               <w:rPr>
                 <w:rFonts w:ascii="Times New Roman" w:hAnsi="Times New Roman"/>
+                <w:b w:val="0"/>
+                <w:sz w:val="18"/>
+              </w:rPr>
+              <w:t>30</w:t>
+            </w:r>
+          </w:p>
+        </w:tc>
+        <w:tc>
+          <w:tcPr>
+            <w:tcW w:type="dxa" w:w="1701"/>
+          </w:tcPr>
+          <w:p>
+            <w:pPr>
+              <w:jc w:val="left"/>
+            </w:pPr>
+            <w:r>
+              <w:rPr>
+                <w:rFonts w:ascii="Times New Roman" w:hAnsi="Times New Roman"/>
+                <w:b w:val="0"/>
                 <w:sz w:val="18"/>
               </w:rPr>
               <w:t>лоток</w:t>
@@ -977,7 +1391,7 @@
         </w:tc>
         <w:tc>
           <w:tcPr>
-            <w:tcW w:type="dxa" w:w="2835"/>
+            <w:tcW w:type="dxa" w:w="850"/>
           </w:tcPr>
           <w:p>
             <w:pPr>
@@ -986,17 +1400,16 @@
             <w:r>
               <w:rPr>
                 <w:rFonts w:ascii="Times New Roman" w:hAnsi="Times New Roman"/>
+                <w:b w:val="0"/>
                 <w:sz w:val="18"/>
               </w:rPr>
-              <w:t>ΔU=2.36%</w:t>
+              <w:t>20</w:t>
             </w:r>
           </w:p>
         </w:tc>
-      </w:tr>
-      <w:tr>
         <w:tc>
           <w:tcPr>
-            <w:tcW w:type="dxa" w:w="454"/>
+            <w:tcW w:type="dxa" w:w="850"/>
           </w:tcPr>
           <w:p>
             <w:pPr>
@@ -1005,6 +1418,44 @@
             <w:r>
               <w:rPr>
                 <w:rFonts w:ascii="Times New Roman" w:hAnsi="Times New Roman"/>
+                <w:b w:val="0"/>
+                <w:sz w:val="18"/>
+              </w:rPr>
+              <w:t>2.36</w:t>
+            </w:r>
+          </w:p>
+        </w:tc>
+        <w:tc>
+          <w:tcPr>
+            <w:tcW w:type="dxa" w:w="2268"/>
+          </w:tcPr>
+          <w:p>
+            <w:pPr>
+              <w:jc w:val="left"/>
+            </w:pPr>
+            <w:r>
+              <w:rPr>
+                <w:rFonts w:ascii="Times New Roman" w:hAnsi="Times New Roman"/>
+                <w:b w:val="0"/>
+                <w:sz w:val="18"/>
+              </w:rPr>
+            </w:r>
+          </w:p>
+        </w:tc>
+      </w:tr>
+      <w:tr>
+        <w:tc>
+          <w:tcPr>
+            <w:tcW w:type="dxa" w:w="397"/>
+          </w:tcPr>
+          <w:p>
+            <w:pPr>
+              <w:jc w:val="center"/>
+            </w:pPr>
+            <w:r>
+              <w:rPr>
+                <w:rFonts w:ascii="Times New Roman" w:hAnsi="Times New Roman"/>
+                <w:b w:val="0"/>
                 <w:sz w:val="18"/>
               </w:rPr>
               <w:t>6</w:t>
@@ -1013,7 +1464,7 @@
         </w:tc>
         <w:tc>
           <w:tcPr>
-            <w:tcW w:type="dxa" w:w="1984"/>
+            <w:tcW w:type="dxa" w:w="1417"/>
           </w:tcPr>
           <w:p>
             <w:pPr>
@@ -1022,6 +1473,25 @@
             <w:r>
               <w:rPr>
                 <w:rFonts w:ascii="Times New Roman" w:hAnsi="Times New Roman"/>
+                <w:b w:val="0"/>
+                <w:sz w:val="18"/>
+              </w:rPr>
+              <w:t>КЛ-ЩС1-01</w:t>
+            </w:r>
+          </w:p>
+        </w:tc>
+        <w:tc>
+          <w:tcPr>
+            <w:tcW w:type="dxa" w:w="1814"/>
+          </w:tcPr>
+          <w:p>
+            <w:pPr>
+              <w:jc w:val="left"/>
+            </w:pPr>
+            <w:r>
+              <w:rPr>
+                <w:rFonts w:ascii="Times New Roman" w:hAnsi="Times New Roman"/>
+                <w:b w:val="0"/>
                 <w:sz w:val="18"/>
               </w:rPr>
               <w:t>ВВГнг-LS</w:t>
@@ -1039,15 +1509,16 @@
             <w:r>
               <w:rPr>
                 <w:rFonts w:ascii="Times New Roman" w:hAnsi="Times New Roman"/>
+                <w:b w:val="0"/>
                 <w:sz w:val="18"/>
               </w:rPr>
-              <w:t>1.5</w:t>
+              <w:t>3×1.5</w:t>
             </w:r>
           </w:p>
         </w:tc>
         <w:tc>
           <w:tcPr>
-            <w:tcW w:type="dxa" w:w="680"/>
+            <w:tcW w:type="dxa" w:w="1984"/>
           </w:tcPr>
           <w:p>
             <w:pPr>
@@ -1056,23 +1527,7 @@
             <w:r>
               <w:rPr>
                 <w:rFonts w:ascii="Times New Roman" w:hAnsi="Times New Roman"/>
-                <w:sz w:val="18"/>
-              </w:rPr>
-              <w:t>3</w:t>
-            </w:r>
-          </w:p>
-        </w:tc>
-        <w:tc>
-          <w:tcPr>
-            <w:tcW w:type="dxa" w:w="1701"/>
-          </w:tcPr>
-          <w:p>
-            <w:pPr>
-              <w:jc w:val="center"/>
-            </w:pPr>
-            <w:r>
-              <w:rPr>
-                <w:rFonts w:ascii="Times New Roman" w:hAnsi="Times New Roman"/>
+                <w:b w:val="0"/>
                 <w:sz w:val="18"/>
               </w:rPr>
               <w:t>ЩС-1</w:t>
@@ -1081,18 +1536,19 @@
         </w:tc>
         <w:tc>
           <w:tcPr>
-            <w:tcW w:type="dxa" w:w="1701"/>
+            <w:tcW w:type="dxa" w:w="3118"/>
           </w:tcPr>
           <w:p>
             <w:pPr>
-              <w:jc w:val="center"/>
+              <w:jc w:val="left"/>
             </w:pPr>
             <w:r>
               <w:rPr>
                 <w:rFonts w:ascii="Times New Roman" w:hAnsi="Times New Roman"/>
+                <w:b w:val="0"/>
                 <w:sz w:val="18"/>
               </w:rPr>
-              <w:t>РЗ-01</w:t>
+              <w:t>Розетки зона А</w:t>
             </w:r>
           </w:p>
         </w:tc>
@@ -1107,6 +1563,7 @@
             <w:r>
               <w:rPr>
                 <w:rFonts w:ascii="Times New Roman" w:hAnsi="Times New Roman"/>
+                <w:b w:val="0"/>
                 <w:sz w:val="18"/>
               </w:rPr>
               <w:t>20</w:t>
@@ -1115,7 +1572,7 @@
         </w:tc>
         <w:tc>
           <w:tcPr>
-            <w:tcW w:type="dxa" w:w="1984"/>
+            <w:tcW w:type="dxa" w:w="1134"/>
           </w:tcPr>
           <w:p>
             <w:pPr>
@@ -1124,6 +1581,25 @@
             <w:r>
               <w:rPr>
                 <w:rFonts w:ascii="Times New Roman" w:hAnsi="Times New Roman"/>
+                <w:b w:val="0"/>
+                <w:sz w:val="18"/>
+              </w:rPr>
+              <w:t>24</w:t>
+            </w:r>
+          </w:p>
+        </w:tc>
+        <w:tc>
+          <w:tcPr>
+            <w:tcW w:type="dxa" w:w="1701"/>
+          </w:tcPr>
+          <w:p>
+            <w:pPr>
+              <w:jc w:val="left"/>
+            </w:pPr>
+            <w:r>
+              <w:rPr>
+                <w:rFonts w:ascii="Times New Roman" w:hAnsi="Times New Roman"/>
+                <w:b w:val="0"/>
                 <w:sz w:val="18"/>
               </w:rPr>
               <w:t>лоток</w:t>
@@ -1132,7 +1608,7 @@
         </w:tc>
         <w:tc>
           <w:tcPr>
-            <w:tcW w:type="dxa" w:w="2835"/>
+            <w:tcW w:type="dxa" w:w="850"/>
           </w:tcPr>
           <w:p>
             <w:pPr>
@@ -1141,17 +1617,16 @@
             <w:r>
               <w:rPr>
                 <w:rFonts w:ascii="Times New Roman" w:hAnsi="Times New Roman"/>
+                <w:b w:val="0"/>
                 <w:sz w:val="18"/>
               </w:rPr>
-              <w:t>Розетки зона А</w:t>
+              <w:t>6</w:t>
             </w:r>
           </w:p>
         </w:tc>
-      </w:tr>
-      <w:tr>
         <w:tc>
           <w:tcPr>
-            <w:tcW w:type="dxa" w:w="454"/>
+            <w:tcW w:type="dxa" w:w="850"/>
           </w:tcPr>
           <w:p>
             <w:pPr>
@@ -1160,6 +1635,45 @@
             <w:r>
               <w:rPr>
                 <w:rFonts w:ascii="Times New Roman" w:hAnsi="Times New Roman"/>
+                <w:b w:val="0"/>
+                <w:sz w:val="18"/>
+              </w:rPr>
+              <w:t>0.44</w:t>
+            </w:r>
+          </w:p>
+        </w:tc>
+        <w:tc>
+          <w:tcPr>
+            <w:tcW w:type="dxa" w:w="2268"/>
+          </w:tcPr>
+          <w:p>
+            <w:pPr>
+              <w:jc w:val="left"/>
+            </w:pPr>
+            <w:r>
+              <w:rPr>
+                <w:rFonts w:ascii="Times New Roman" w:hAnsi="Times New Roman"/>
+                <w:b w:val="0"/>
+                <w:sz w:val="18"/>
+              </w:rPr>
+              <w:t>план 20м + запас 20%</w:t>
+            </w:r>
+          </w:p>
+        </w:tc>
+      </w:tr>
+      <w:tr>
+        <w:tc>
+          <w:tcPr>
+            <w:tcW w:type="dxa" w:w="397"/>
+          </w:tcPr>
+          <w:p>
+            <w:pPr>
+              <w:jc w:val="center"/>
+            </w:pPr>
+            <w:r>
+              <w:rPr>
+                <w:rFonts w:ascii="Times New Roman" w:hAnsi="Times New Roman"/>
+                <w:b w:val="0"/>
                 <w:sz w:val="18"/>
               </w:rPr>
               <w:t>7</w:t>
@@ -1168,7 +1682,7 @@
         </w:tc>
         <w:tc>
           <w:tcPr>
-            <w:tcW w:type="dxa" w:w="1984"/>
+            <w:tcW w:type="dxa" w:w="1417"/>
           </w:tcPr>
           <w:p>
             <w:pPr>
@@ -1177,6 +1691,25 @@
             <w:r>
               <w:rPr>
                 <w:rFonts w:ascii="Times New Roman" w:hAnsi="Times New Roman"/>
+                <w:b w:val="0"/>
+                <w:sz w:val="18"/>
+              </w:rPr>
+              <w:t>КЛ-ЩС1-02</w:t>
+            </w:r>
+          </w:p>
+        </w:tc>
+        <w:tc>
+          <w:tcPr>
+            <w:tcW w:type="dxa" w:w="1814"/>
+          </w:tcPr>
+          <w:p>
+            <w:pPr>
+              <w:jc w:val="left"/>
+            </w:pPr>
+            <w:r>
+              <w:rPr>
+                <w:rFonts w:ascii="Times New Roman" w:hAnsi="Times New Roman"/>
+                <w:b w:val="0"/>
                 <w:sz w:val="18"/>
               </w:rPr>
               <w:t>ВВГнг-LS</w:t>
@@ -1194,15 +1727,16 @@
             <w:r>
               <w:rPr>
                 <w:rFonts w:ascii="Times New Roman" w:hAnsi="Times New Roman"/>
+                <w:b w:val="0"/>
                 <w:sz w:val="18"/>
               </w:rPr>
-              <w:t>1.5</w:t>
+              <w:t>3×1.5</w:t>
             </w:r>
           </w:p>
         </w:tc>
         <w:tc>
           <w:tcPr>
-            <w:tcW w:type="dxa" w:w="680"/>
+            <w:tcW w:type="dxa" w:w="1984"/>
           </w:tcPr>
           <w:p>
             <w:pPr>
@@ -1211,23 +1745,7 @@
             <w:r>
               <w:rPr>
                 <w:rFonts w:ascii="Times New Roman" w:hAnsi="Times New Roman"/>
-                <w:sz w:val="18"/>
-              </w:rPr>
-              <w:t>3</w:t>
-            </w:r>
-          </w:p>
-        </w:tc>
-        <w:tc>
-          <w:tcPr>
-            <w:tcW w:type="dxa" w:w="1701"/>
-          </w:tcPr>
-          <w:p>
-            <w:pPr>
-              <w:jc w:val="center"/>
-            </w:pPr>
-            <w:r>
-              <w:rPr>
-                <w:rFonts w:ascii="Times New Roman" w:hAnsi="Times New Roman"/>
+                <w:b w:val="0"/>
                 <w:sz w:val="18"/>
               </w:rPr>
               <w:t>ЩС-1</w:t>
@@ -1236,18 +1754,19 @@
         </w:tc>
         <w:tc>
           <w:tcPr>
-            <w:tcW w:type="dxa" w:w="1701"/>
+            <w:tcW w:type="dxa" w:w="3118"/>
           </w:tcPr>
           <w:p>
             <w:pPr>
-              <w:jc w:val="center"/>
+              <w:jc w:val="left"/>
             </w:pPr>
             <w:r>
               <w:rPr>
                 <w:rFonts w:ascii="Times New Roman" w:hAnsi="Times New Roman"/>
+                <w:b w:val="0"/>
                 <w:sz w:val="18"/>
               </w:rPr>
-              <w:t>РЗ-02</w:t>
+              <w:t>Розетки зона Б</w:t>
             </w:r>
           </w:p>
         </w:tc>
@@ -1262,6 +1781,7 @@
             <w:r>
               <w:rPr>
                 <w:rFonts w:ascii="Times New Roman" w:hAnsi="Times New Roman"/>
+                <w:b w:val="0"/>
                 <w:sz w:val="18"/>
               </w:rPr>
               <w:t>35</w:t>
@@ -1270,7 +1790,7 @@
         </w:tc>
         <w:tc>
           <w:tcPr>
-            <w:tcW w:type="dxa" w:w="1984"/>
+            <w:tcW w:type="dxa" w:w="1134"/>
           </w:tcPr>
           <w:p>
             <w:pPr>
@@ -1279,6 +1799,25 @@
             <w:r>
               <w:rPr>
                 <w:rFonts w:ascii="Times New Roman" w:hAnsi="Times New Roman"/>
+                <w:b w:val="0"/>
+                <w:sz w:val="18"/>
+              </w:rPr>
+              <w:t>42</w:t>
+            </w:r>
+          </w:p>
+        </w:tc>
+        <w:tc>
+          <w:tcPr>
+            <w:tcW w:type="dxa" w:w="1701"/>
+          </w:tcPr>
+          <w:p>
+            <w:pPr>
+              <w:jc w:val="left"/>
+            </w:pPr>
+            <w:r>
+              <w:rPr>
+                <w:rFonts w:ascii="Times New Roman" w:hAnsi="Times New Roman"/>
+                <w:b w:val="0"/>
                 <w:sz w:val="18"/>
               </w:rPr>
               <w:t>лоток</w:t>
@@ -1287,7 +1826,7 @@
         </w:tc>
         <w:tc>
           <w:tcPr>
-            <w:tcW w:type="dxa" w:w="2835"/>
+            <w:tcW w:type="dxa" w:w="850"/>
           </w:tcPr>
           <w:p>
             <w:pPr>
@@ -1296,17 +1835,16 @@
             <w:r>
               <w:rPr>
                 <w:rFonts w:ascii="Times New Roman" w:hAnsi="Times New Roman"/>
+                <w:b w:val="0"/>
                 <w:sz w:val="18"/>
               </w:rPr>
-              <w:t>Розетки зона Б</w:t>
+              <w:t>6</w:t>
             </w:r>
           </w:p>
         </w:tc>
-      </w:tr>
-      <w:tr>
         <w:tc>
           <w:tcPr>
-            <w:tcW w:type="dxa" w:w="454"/>
+            <w:tcW w:type="dxa" w:w="850"/>
           </w:tcPr>
           <w:p>
             <w:pPr>
@@ -1315,6 +1853,45 @@
             <w:r>
               <w:rPr>
                 <w:rFonts w:ascii="Times New Roman" w:hAnsi="Times New Roman"/>
+                <w:b w:val="0"/>
+                <w:sz w:val="18"/>
+              </w:rPr>
+              <w:t>0.78</w:t>
+            </w:r>
+          </w:p>
+        </w:tc>
+        <w:tc>
+          <w:tcPr>
+            <w:tcW w:type="dxa" w:w="2268"/>
+          </w:tcPr>
+          <w:p>
+            <w:pPr>
+              <w:jc w:val="left"/>
+            </w:pPr>
+            <w:r>
+              <w:rPr>
+                <w:rFonts w:ascii="Times New Roman" w:hAnsi="Times New Roman"/>
+                <w:b w:val="0"/>
+                <w:sz w:val="18"/>
+              </w:rPr>
+              <w:t>план 35м + запас 20%</w:t>
+            </w:r>
+          </w:p>
+        </w:tc>
+      </w:tr>
+      <w:tr>
+        <w:tc>
+          <w:tcPr>
+            <w:tcW w:type="dxa" w:w="397"/>
+          </w:tcPr>
+          <w:p>
+            <w:pPr>
+              <w:jc w:val="center"/>
+            </w:pPr>
+            <w:r>
+              <w:rPr>
+                <w:rFonts w:ascii="Times New Roman" w:hAnsi="Times New Roman"/>
+                <w:b w:val="0"/>
                 <w:sz w:val="18"/>
               </w:rPr>
               <w:t>8</w:t>
@@ -1323,7 +1900,7 @@
         </w:tc>
         <w:tc>
           <w:tcPr>
-            <w:tcW w:type="dxa" w:w="1984"/>
+            <w:tcW w:type="dxa" w:w="1417"/>
           </w:tcPr>
           <w:p>
             <w:pPr>
@@ -1332,6 +1909,25 @@
             <w:r>
               <w:rPr>
                 <w:rFonts w:ascii="Times New Roman" w:hAnsi="Times New Roman"/>
+                <w:b w:val="0"/>
+                <w:sz w:val="18"/>
+              </w:rPr>
+              <w:t>КЛ-ЩС1-03</w:t>
+            </w:r>
+          </w:p>
+        </w:tc>
+        <w:tc>
+          <w:tcPr>
+            <w:tcW w:type="dxa" w:w="1814"/>
+          </w:tcPr>
+          <w:p>
+            <w:pPr>
+              <w:jc w:val="left"/>
+            </w:pPr>
+            <w:r>
+              <w:rPr>
+                <w:rFonts w:ascii="Times New Roman" w:hAnsi="Times New Roman"/>
+                <w:b w:val="0"/>
                 <w:sz w:val="18"/>
               </w:rPr>
               <w:t>ВВГнг-LS</w:t>
@@ -1349,15 +1945,16 @@
             <w:r>
               <w:rPr>
                 <w:rFonts w:ascii="Times New Roman" w:hAnsi="Times New Roman"/>
+                <w:b w:val="0"/>
                 <w:sz w:val="18"/>
               </w:rPr>
-              <w:t>1.5</w:t>
+              <w:t>3×1.5</w:t>
             </w:r>
           </w:p>
         </w:tc>
         <w:tc>
           <w:tcPr>
-            <w:tcW w:type="dxa" w:w="680"/>
+            <w:tcW w:type="dxa" w:w="1984"/>
           </w:tcPr>
           <w:p>
             <w:pPr>
@@ -1366,23 +1963,7 @@
             <w:r>
               <w:rPr>
                 <w:rFonts w:ascii="Times New Roman" w:hAnsi="Times New Roman"/>
-                <w:sz w:val="18"/>
-              </w:rPr>
-              <w:t>3</w:t>
-            </w:r>
-          </w:p>
-        </w:tc>
-        <w:tc>
-          <w:tcPr>
-            <w:tcW w:type="dxa" w:w="1701"/>
-          </w:tcPr>
-          <w:p>
-            <w:pPr>
-              <w:jc w:val="center"/>
-            </w:pPr>
-            <w:r>
-              <w:rPr>
-                <w:rFonts w:ascii="Times New Roman" w:hAnsi="Times New Roman"/>
+                <w:b w:val="0"/>
                 <w:sz w:val="18"/>
               </w:rPr>
               <w:t>ЩС-1</w:t>
@@ -1391,18 +1972,19 @@
         </w:tc>
         <w:tc>
           <w:tcPr>
-            <w:tcW w:type="dxa" w:w="1701"/>
+            <w:tcW w:type="dxa" w:w="3118"/>
           </w:tcPr>
           <w:p>
             <w:pPr>
-              <w:jc w:val="center"/>
+              <w:jc w:val="left"/>
             </w:pPr>
             <w:r>
               <w:rPr>
                 <w:rFonts w:ascii="Times New Roman" w:hAnsi="Times New Roman"/>
+                <w:b w:val="0"/>
                 <w:sz w:val="18"/>
               </w:rPr>
-              <w:t>ИТ-01</w:t>
+              <w:t>ИТ-оборудование серверная</w:t>
             </w:r>
           </w:p>
         </w:tc>
@@ -1417,6 +1999,7 @@
             <w:r>
               <w:rPr>
                 <w:rFonts w:ascii="Times New Roman" w:hAnsi="Times New Roman"/>
+                <w:b w:val="0"/>
                 <w:sz w:val="18"/>
               </w:rPr>
               <w:t>15</w:t>
@@ -1425,7 +2008,7 @@
         </w:tc>
         <w:tc>
           <w:tcPr>
-            <w:tcW w:type="dxa" w:w="1984"/>
+            <w:tcW w:type="dxa" w:w="1134"/>
           </w:tcPr>
           <w:p>
             <w:pPr>
@@ -1434,6 +2017,25 @@
             <w:r>
               <w:rPr>
                 <w:rFonts w:ascii="Times New Roman" w:hAnsi="Times New Roman"/>
+                <w:b w:val="0"/>
+                <w:sz w:val="18"/>
+              </w:rPr>
+              <w:t>18</w:t>
+            </w:r>
+          </w:p>
+        </w:tc>
+        <w:tc>
+          <w:tcPr>
+            <w:tcW w:type="dxa" w:w="1701"/>
+          </w:tcPr>
+          <w:p>
+            <w:pPr>
+              <w:jc w:val="left"/>
+            </w:pPr>
+            <w:r>
+              <w:rPr>
+                <w:rFonts w:ascii="Times New Roman" w:hAnsi="Times New Roman"/>
+                <w:b w:val="0"/>
                 <w:sz w:val="18"/>
               </w:rPr>
               <w:t>лоток</w:t>
@@ -1442,7 +2044,7 @@
         </w:tc>
         <w:tc>
           <w:tcPr>
-            <w:tcW w:type="dxa" w:w="2835"/>
+            <w:tcW w:type="dxa" w:w="850"/>
           </w:tcPr>
           <w:p>
             <w:pPr>
@@ -1451,17 +2053,16 @@
             <w:r>
               <w:rPr>
                 <w:rFonts w:ascii="Times New Roman" w:hAnsi="Times New Roman"/>
+                <w:b w:val="0"/>
                 <w:sz w:val="18"/>
               </w:rPr>
-              <w:t>ИТ-оборудование серверная</w:t>
+              <w:t>10</w:t>
             </w:r>
           </w:p>
         </w:tc>
-      </w:tr>
-      <w:tr>
         <w:tc>
           <w:tcPr>
-            <w:tcW w:type="dxa" w:w="454"/>
+            <w:tcW w:type="dxa" w:w="850"/>
           </w:tcPr>
           <w:p>
             <w:pPr>
@@ -1470,6 +2071,66 @@
             <w:r>
               <w:rPr>
                 <w:rFonts w:ascii="Times New Roman" w:hAnsi="Times New Roman"/>
+                <w:b w:val="0"/>
+                <w:sz w:val="18"/>
+              </w:rPr>
+              <w:t>0.75</w:t>
+            </w:r>
+          </w:p>
+        </w:tc>
+        <w:tc>
+          <w:tcPr>
+            <w:tcW w:type="dxa" w:w="2268"/>
+          </w:tcPr>
+          <w:p>
+            <w:pPr>
+              <w:jc w:val="left"/>
+            </w:pPr>
+            <w:r>
+              <w:rPr>
+                <w:rFonts w:ascii="Times New Roman" w:hAnsi="Times New Roman"/>
+                <w:b w:val="0"/>
+                <w:sz w:val="18"/>
+              </w:rPr>
+              <w:t>план 15м + запас 20%</w:t>
+            </w:r>
+          </w:p>
+        </w:tc>
+      </w:tr>
+      <w:tr>
+        <w:tc>
+          <w:tcPr>
+            <w:tcW w:type="dxa" w:w="22104"/>
+            <w:gridSpan w:val="12"/>
+          </w:tcPr>
+          <w:p>
+            <w:pPr>
+              <w:jc w:val="left"/>
+            </w:pPr>
+            <w:r>
+              <w:rPr>
+                <w:rFonts w:ascii="Times New Roman" w:hAnsi="Times New Roman"/>
+                <w:b/>
+                <w:sz w:val="18"/>
+              </w:rPr>
+              <w:t xml:space="preserve">  Раздел: Климатические системы</w:t>
+            </w:r>
+          </w:p>
+        </w:tc>
+      </w:tr>
+      <w:tr>
+        <w:tc>
+          <w:tcPr>
+            <w:tcW w:type="dxa" w:w="397"/>
+          </w:tcPr>
+          <w:p>
+            <w:pPr>
+              <w:jc w:val="center"/>
+            </w:pPr>
+            <w:r>
+              <w:rPr>
+                <w:rFonts w:ascii="Times New Roman" w:hAnsi="Times New Roman"/>
+                <w:b w:val="0"/>
                 <w:sz w:val="18"/>
               </w:rPr>
               <w:t>9</w:t>
@@ -1478,7 +2139,7 @@
         </w:tc>
         <w:tc>
           <w:tcPr>
-            <w:tcW w:type="dxa" w:w="1984"/>
+            <w:tcW w:type="dxa" w:w="1417"/>
           </w:tcPr>
           <w:p>
             <w:pPr>
@@ -1487,6 +2148,25 @@
             <w:r>
               <w:rPr>
                 <w:rFonts w:ascii="Times New Roman" w:hAnsi="Times New Roman"/>
+                <w:b w:val="0"/>
+                <w:sz w:val="18"/>
+              </w:rPr>
+              <w:t>—</w:t>
+            </w:r>
+          </w:p>
+        </w:tc>
+        <w:tc>
+          <w:tcPr>
+            <w:tcW w:type="dxa" w:w="1814"/>
+          </w:tcPr>
+          <w:p>
+            <w:pPr>
+              <w:jc w:val="left"/>
+            </w:pPr>
+            <w:r>
+              <w:rPr>
+                <w:rFonts w:ascii="Times New Roman" w:hAnsi="Times New Roman"/>
+                <w:b w:val="0"/>
                 <w:sz w:val="18"/>
               </w:rPr>
               <w:t>ВВГнг-LS</w:t>
@@ -1504,15 +2184,16 @@
             <w:r>
               <w:rPr>
                 <w:rFonts w:ascii="Times New Roman" w:hAnsi="Times New Roman"/>
+                <w:b w:val="0"/>
                 <w:sz w:val="18"/>
               </w:rPr>
-              <w:t>1.5</w:t>
+              <w:t>4×1.5</w:t>
             </w:r>
           </w:p>
         </w:tc>
         <w:tc>
           <w:tcPr>
-            <w:tcW w:type="dxa" w:w="680"/>
+            <w:tcW w:type="dxa" w:w="1984"/>
           </w:tcPr>
           <w:p>
             <w:pPr>
@@ -1521,23 +2202,7 @@
             <w:r>
               <w:rPr>
                 <w:rFonts w:ascii="Times New Roman" w:hAnsi="Times New Roman"/>
-                <w:sz w:val="18"/>
-              </w:rPr>
-              <w:t>4</w:t>
-            </w:r>
-          </w:p>
-        </w:tc>
-        <w:tc>
-          <w:tcPr>
-            <w:tcW w:type="dxa" w:w="1701"/>
-          </w:tcPr>
-          <w:p>
-            <w:pPr>
-              <w:jc w:val="center"/>
-            </w:pPr>
-            <w:r>
-              <w:rPr>
-                <w:rFonts w:ascii="Times New Roman" w:hAnsi="Times New Roman"/>
+                <w:b w:val="0"/>
                 <w:sz w:val="18"/>
               </w:rPr>
               <w:t>ВРУ-1</w:t>
@@ -1546,18 +2211,19 @@
         </w:tc>
         <w:tc>
           <w:tcPr>
-            <w:tcW w:type="dxa" w:w="1701"/>
+            <w:tcW w:type="dxa" w:w="3118"/>
           </w:tcPr>
           <w:p>
             <w:pPr>
-              <w:jc w:val="center"/>
+              <w:jc w:val="left"/>
             </w:pPr>
             <w:r>
               <w:rPr>
                 <w:rFonts w:ascii="Times New Roman" w:hAnsi="Times New Roman"/>
+                <w:b w:val="0"/>
                 <w:sz w:val="18"/>
               </w:rPr>
-              <w:t>ЩК-1</w:t>
+              <w:t>Щит климатический №1</w:t>
             </w:r>
           </w:p>
         </w:tc>
@@ -1572,6 +2238,7 @@
             <w:r>
               <w:rPr>
                 <w:rFonts w:ascii="Times New Roman" w:hAnsi="Times New Roman"/>
+                <w:b w:val="0"/>
                 <w:sz w:val="18"/>
               </w:rPr>
               <w:t>40</w:t>
@@ -1580,7 +2247,7 @@
         </w:tc>
         <w:tc>
           <w:tcPr>
-            <w:tcW w:type="dxa" w:w="1984"/>
+            <w:tcW w:type="dxa" w:w="1134"/>
           </w:tcPr>
           <w:p>
             <w:pPr>
@@ -1589,6 +2256,25 @@
             <w:r>
               <w:rPr>
                 <w:rFonts w:ascii="Times New Roman" w:hAnsi="Times New Roman"/>
+                <w:b w:val="0"/>
+                <w:sz w:val="18"/>
+              </w:rPr>
+              <w:t>40</w:t>
+            </w:r>
+          </w:p>
+        </w:tc>
+        <w:tc>
+          <w:tcPr>
+            <w:tcW w:type="dxa" w:w="1701"/>
+          </w:tcPr>
+          <w:p>
+            <w:pPr>
+              <w:jc w:val="left"/>
+            </w:pPr>
+            <w:r>
+              <w:rPr>
+                <w:rFonts w:ascii="Times New Roman" w:hAnsi="Times New Roman"/>
+                <w:b w:val="0"/>
                 <w:sz w:val="18"/>
               </w:rPr>
               <w:t>лоток</w:t>
@@ -1597,7 +2283,7 @@
         </w:tc>
         <w:tc>
           <w:tcPr>
-            <w:tcW w:type="dxa" w:w="2835"/>
+            <w:tcW w:type="dxa" w:w="850"/>
           </w:tcPr>
           <w:p>
             <w:pPr>
@@ -1606,17 +2292,16 @@
             <w:r>
               <w:rPr>
                 <w:rFonts w:ascii="Times New Roman" w:hAnsi="Times New Roman"/>
+                <w:b w:val="0"/>
                 <w:sz w:val="18"/>
               </w:rPr>
-              <w:t>ΔU=2.96%</w:t>
+              <w:t>16</w:t>
             </w:r>
           </w:p>
         </w:tc>
-      </w:tr>
-      <w:tr>
         <w:tc>
           <w:tcPr>
-            <w:tcW w:type="dxa" w:w="454"/>
+            <w:tcW w:type="dxa" w:w="850"/>
           </w:tcPr>
           <w:p>
             <w:pPr>
@@ -1625,6 +2310,44 @@
             <w:r>
               <w:rPr>
                 <w:rFonts w:ascii="Times New Roman" w:hAnsi="Times New Roman"/>
+                <w:b w:val="0"/>
+                <w:sz w:val="18"/>
+              </w:rPr>
+              <w:t>2.96</w:t>
+            </w:r>
+          </w:p>
+        </w:tc>
+        <w:tc>
+          <w:tcPr>
+            <w:tcW w:type="dxa" w:w="2268"/>
+          </w:tcPr>
+          <w:p>
+            <w:pPr>
+              <w:jc w:val="left"/>
+            </w:pPr>
+            <w:r>
+              <w:rPr>
+                <w:rFonts w:ascii="Times New Roman" w:hAnsi="Times New Roman"/>
+                <w:b w:val="0"/>
+                <w:sz w:val="18"/>
+              </w:rPr>
+            </w:r>
+          </w:p>
+        </w:tc>
+      </w:tr>
+      <w:tr>
+        <w:tc>
+          <w:tcPr>
+            <w:tcW w:type="dxa" w:w="397"/>
+          </w:tcPr>
+          <w:p>
+            <w:pPr>
+              <w:jc w:val="center"/>
+            </w:pPr>
+            <w:r>
+              <w:rPr>
+                <w:rFonts w:ascii="Times New Roman" w:hAnsi="Times New Roman"/>
+                <w:b w:val="0"/>
                 <w:sz w:val="18"/>
               </w:rPr>
               <w:t>10</w:t>
@@ -1633,7 +2356,7 @@
         </w:tc>
         <w:tc>
           <w:tcPr>
-            <w:tcW w:type="dxa" w:w="1984"/>
+            <w:tcW w:type="dxa" w:w="1417"/>
           </w:tcPr>
           <w:p>
             <w:pPr>
@@ -1642,6 +2365,25 @@
             <w:r>
               <w:rPr>
                 <w:rFonts w:ascii="Times New Roman" w:hAnsi="Times New Roman"/>
+                <w:b w:val="0"/>
+                <w:sz w:val="18"/>
+              </w:rPr>
+              <w:t>КЛ-ЩК1-01</w:t>
+            </w:r>
+          </w:p>
+        </w:tc>
+        <w:tc>
+          <w:tcPr>
+            <w:tcW w:type="dxa" w:w="1814"/>
+          </w:tcPr>
+          <w:p>
+            <w:pPr>
+              <w:jc w:val="left"/>
+            </w:pPr>
+            <w:r>
+              <w:rPr>
+                <w:rFonts w:ascii="Times New Roman" w:hAnsi="Times New Roman"/>
+                <w:b w:val="0"/>
                 <w:sz w:val="18"/>
               </w:rPr>
               <w:t>ВВГнг-LS</w:t>
@@ -1659,15 +2401,16 @@
             <w:r>
               <w:rPr>
                 <w:rFonts w:ascii="Times New Roman" w:hAnsi="Times New Roman"/>
+                <w:b w:val="0"/>
                 <w:sz w:val="18"/>
               </w:rPr>
-              <w:t>1.5</w:t>
+              <w:t>4×1.5</w:t>
             </w:r>
           </w:p>
         </w:tc>
         <w:tc>
           <w:tcPr>
-            <w:tcW w:type="dxa" w:w="680"/>
+            <w:tcW w:type="dxa" w:w="1984"/>
           </w:tcPr>
           <w:p>
             <w:pPr>
@@ -1676,9 +2419,2202 @@
             <w:r>
               <w:rPr>
                 <w:rFonts w:ascii="Times New Roman" w:hAnsi="Times New Roman"/>
+                <w:b w:val="0"/>
                 <w:sz w:val="18"/>
               </w:rPr>
-              <w:t>4</w:t>
+              <w:t>ЩК-1</w:t>
+            </w:r>
+          </w:p>
+        </w:tc>
+        <w:tc>
+          <w:tcPr>
+            <w:tcW w:type="dxa" w:w="3118"/>
+          </w:tcPr>
+          <w:p>
+            <w:pPr>
+              <w:jc w:val="left"/>
+            </w:pPr>
+            <w:r>
+              <w:rPr>
+                <w:rFonts w:ascii="Times New Roman" w:hAnsi="Times New Roman"/>
+                <w:b w:val="0"/>
+                <w:sz w:val="18"/>
+              </w:rPr>
+              <w:t>Кондиционеры и вентиляция</w:t>
+            </w:r>
+          </w:p>
+        </w:tc>
+        <w:tc>
+          <w:tcPr>
+            <w:tcW w:type="dxa" w:w="1134"/>
+          </w:tcPr>
+          <w:p>
+            <w:pPr>
+              <w:jc w:val="center"/>
+            </w:pPr>
+            <w:r>
+              <w:rPr>
+                <w:rFonts w:ascii="Times New Roman" w:hAnsi="Times New Roman"/>
+                <w:b w:val="0"/>
+                <w:sz w:val="18"/>
+              </w:rPr>
+              <w:t>40</w:t>
+            </w:r>
+          </w:p>
+        </w:tc>
+        <w:tc>
+          <w:tcPr>
+            <w:tcW w:type="dxa" w:w="1134"/>
+          </w:tcPr>
+          <w:p>
+            <w:pPr>
+              <w:jc w:val="center"/>
+            </w:pPr>
+            <w:r>
+              <w:rPr>
+                <w:rFonts w:ascii="Times New Roman" w:hAnsi="Times New Roman"/>
+                <w:b w:val="0"/>
+                <w:sz w:val="18"/>
+              </w:rPr>
+              <w:t>48</w:t>
+            </w:r>
+          </w:p>
+        </w:tc>
+        <w:tc>
+          <w:tcPr>
+            <w:tcW w:type="dxa" w:w="1701"/>
+          </w:tcPr>
+          <w:p>
+            <w:pPr>
+              <w:jc w:val="left"/>
+            </w:pPr>
+            <w:r>
+              <w:rPr>
+                <w:rFonts w:ascii="Times New Roman" w:hAnsi="Times New Roman"/>
+                <w:b w:val="0"/>
+                <w:sz w:val="18"/>
+              </w:rPr>
+              <w:t>лоток</w:t>
+            </w:r>
+          </w:p>
+        </w:tc>
+        <w:tc>
+          <w:tcPr>
+            <w:tcW w:type="dxa" w:w="850"/>
+          </w:tcPr>
+          <w:p>
+            <w:pPr>
+              <w:jc w:val="center"/>
+            </w:pPr>
+            <w:r>
+              <w:rPr>
+                <w:rFonts w:ascii="Times New Roman" w:hAnsi="Times New Roman"/>
+                <w:b w:val="0"/>
+                <w:sz w:val="18"/>
+              </w:rPr>
+              <w:t>16</w:t>
+            </w:r>
+          </w:p>
+        </w:tc>
+        <w:tc>
+          <w:tcPr>
+            <w:tcW w:type="dxa" w:w="850"/>
+          </w:tcPr>
+          <w:p>
+            <w:pPr>
+              <w:jc w:val="center"/>
+            </w:pPr>
+            <w:r>
+              <w:rPr>
+                <w:rFonts w:ascii="Times New Roman" w:hAnsi="Times New Roman"/>
+                <w:b w:val="0"/>
+                <w:sz w:val="18"/>
+              </w:rPr>
+              <w:t>3.55</w:t>
+            </w:r>
+          </w:p>
+        </w:tc>
+        <w:tc>
+          <w:tcPr>
+            <w:tcW w:type="dxa" w:w="2268"/>
+          </w:tcPr>
+          <w:p>
+            <w:pPr>
+              <w:jc w:val="left"/>
+            </w:pPr>
+            <w:r>
+              <w:rPr>
+                <w:rFonts w:ascii="Times New Roman" w:hAnsi="Times New Roman"/>
+                <w:b w:val="0"/>
+                <w:sz w:val="18"/>
+              </w:rPr>
+              <w:t>план 40м + запас 20%</w:t>
+            </w:r>
+          </w:p>
+        </w:tc>
+      </w:tr>
+      <w:tr>
+        <w:tc>
+          <w:tcPr>
+            <w:tcW w:type="dxa" w:w="22104"/>
+            <w:gridSpan w:val="12"/>
+          </w:tcPr>
+          <w:p>
+            <w:pPr>
+              <w:jc w:val="left"/>
+            </w:pPr>
+            <w:r>
+              <w:rPr>
+                <w:rFonts w:ascii="Times New Roman" w:hAnsi="Times New Roman"/>
+                <w:b/>
+                <w:sz w:val="18"/>
+              </w:rPr>
+              <w:t xml:space="preserve">  Раздел: ОВ</w:t>
+            </w:r>
+          </w:p>
+        </w:tc>
+      </w:tr>
+      <w:tr>
+        <w:tc>
+          <w:tcPr>
+            <w:tcW w:type="dxa" w:w="397"/>
+          </w:tcPr>
+          <w:p>
+            <w:pPr>
+              <w:jc w:val="center"/>
+            </w:pPr>
+            <w:r>
+              <w:rPr>
+                <w:rFonts w:ascii="Times New Roman" w:hAnsi="Times New Roman"/>
+                <w:b w:val="0"/>
+                <w:sz w:val="18"/>
+              </w:rPr>
+              <w:t>11</w:t>
+            </w:r>
+          </w:p>
+        </w:tc>
+        <w:tc>
+          <w:tcPr>
+            <w:tcW w:type="dxa" w:w="1417"/>
+          </w:tcPr>
+          <w:p>
+            <w:pPr>
+              <w:jc w:val="center"/>
+            </w:pPr>
+            <w:r>
+              <w:rPr>
+                <w:rFonts w:ascii="Times New Roman" w:hAnsi="Times New Roman"/>
+                <w:b w:val="0"/>
+                <w:sz w:val="18"/>
+              </w:rPr>
+              <w:t>—</w:t>
+            </w:r>
+          </w:p>
+        </w:tc>
+        <w:tc>
+          <w:tcPr>
+            <w:tcW w:type="dxa" w:w="1814"/>
+          </w:tcPr>
+          <w:p>
+            <w:pPr>
+              <w:jc w:val="left"/>
+            </w:pPr>
+            <w:r>
+              <w:rPr>
+                <w:rFonts w:ascii="Times New Roman" w:hAnsi="Times New Roman"/>
+                <w:b w:val="0"/>
+                <w:sz w:val="18"/>
+              </w:rPr>
+              <w:t>ВВГнг-LS</w:t>
+            </w:r>
+          </w:p>
+        </w:tc>
+        <w:tc>
+          <w:tcPr>
+            <w:tcW w:type="dxa" w:w="1417"/>
+          </w:tcPr>
+          <w:p>
+            <w:pPr>
+              <w:jc w:val="center"/>
+            </w:pPr>
+            <w:r>
+              <w:rPr>
+                <w:rFonts w:ascii="Times New Roman" w:hAnsi="Times New Roman"/>
+                <w:b w:val="0"/>
+                <w:sz w:val="18"/>
+              </w:rPr>
+              <w:t>4×1.5</w:t>
+            </w:r>
+          </w:p>
+        </w:tc>
+        <w:tc>
+          <w:tcPr>
+            <w:tcW w:type="dxa" w:w="1984"/>
+          </w:tcPr>
+          <w:p>
+            <w:pPr>
+              <w:jc w:val="center"/>
+            </w:pPr>
+            <w:r>
+              <w:rPr>
+                <w:rFonts w:ascii="Times New Roman" w:hAnsi="Times New Roman"/>
+                <w:b w:val="0"/>
+                <w:sz w:val="18"/>
+              </w:rPr>
+              <w:t>ВРУ-1</w:t>
+            </w:r>
+          </w:p>
+        </w:tc>
+        <w:tc>
+          <w:tcPr>
+            <w:tcW w:type="dxa" w:w="3118"/>
+          </w:tcPr>
+          <w:p>
+            <w:pPr>
+              <w:jc w:val="left"/>
+            </w:pPr>
+            <w:r>
+              <w:rPr>
+                <w:rFonts w:ascii="Times New Roman" w:hAnsi="Times New Roman"/>
+                <w:b w:val="0"/>
+                <w:sz w:val="18"/>
+              </w:rPr>
+              <w:t>Щит отопления №1</w:t>
+            </w:r>
+          </w:p>
+        </w:tc>
+        <w:tc>
+          <w:tcPr>
+            <w:tcW w:type="dxa" w:w="1134"/>
+          </w:tcPr>
+          <w:p>
+            <w:pPr>
+              <w:jc w:val="center"/>
+            </w:pPr>
+            <w:r>
+              <w:rPr>
+                <w:rFonts w:ascii="Times New Roman" w:hAnsi="Times New Roman"/>
+                <w:b w:val="0"/>
+                <w:sz w:val="18"/>
+              </w:rPr>
+              <w:t>30</w:t>
+            </w:r>
+          </w:p>
+        </w:tc>
+        <w:tc>
+          <w:tcPr>
+            <w:tcW w:type="dxa" w:w="1134"/>
+          </w:tcPr>
+          <w:p>
+            <w:pPr>
+              <w:jc w:val="center"/>
+            </w:pPr>
+            <w:r>
+              <w:rPr>
+                <w:rFonts w:ascii="Times New Roman" w:hAnsi="Times New Roman"/>
+                <w:b w:val="0"/>
+                <w:sz w:val="18"/>
+              </w:rPr>
+              <w:t>30</w:t>
+            </w:r>
+          </w:p>
+        </w:tc>
+        <w:tc>
+          <w:tcPr>
+            <w:tcW w:type="dxa" w:w="1701"/>
+          </w:tcPr>
+          <w:p>
+            <w:pPr>
+              <w:jc w:val="left"/>
+            </w:pPr>
+            <w:r>
+              <w:rPr>
+                <w:rFonts w:ascii="Times New Roman" w:hAnsi="Times New Roman"/>
+                <w:b w:val="0"/>
+                <w:sz w:val="18"/>
+              </w:rPr>
+              <w:t>лоток</w:t>
+            </w:r>
+          </w:p>
+        </w:tc>
+        <w:tc>
+          <w:tcPr>
+            <w:tcW w:type="dxa" w:w="850"/>
+          </w:tcPr>
+          <w:p>
+            <w:pPr>
+              <w:jc w:val="center"/>
+            </w:pPr>
+            <w:r>
+              <w:rPr>
+                <w:rFonts w:ascii="Times New Roman" w:hAnsi="Times New Roman"/>
+                <w:b w:val="0"/>
+                <w:sz w:val="18"/>
+              </w:rPr>
+              <w:t>6</w:t>
+            </w:r>
+          </w:p>
+        </w:tc>
+        <w:tc>
+          <w:tcPr>
+            <w:tcW w:type="dxa" w:w="850"/>
+          </w:tcPr>
+          <w:p>
+            <w:pPr>
+              <w:jc w:val="center"/>
+            </w:pPr>
+            <w:r>
+              <w:rPr>
+                <w:rFonts w:ascii="Times New Roman" w:hAnsi="Times New Roman"/>
+                <w:b w:val="0"/>
+                <w:sz w:val="18"/>
+              </w:rPr>
+              <w:t>0.67</w:t>
+            </w:r>
+          </w:p>
+        </w:tc>
+        <w:tc>
+          <w:tcPr>
+            <w:tcW w:type="dxa" w:w="2268"/>
+          </w:tcPr>
+          <w:p>
+            <w:pPr>
+              <w:jc w:val="left"/>
+            </w:pPr>
+            <w:r>
+              <w:rPr>
+                <w:rFonts w:ascii="Times New Roman" w:hAnsi="Times New Roman"/>
+                <w:b w:val="0"/>
+                <w:sz w:val="18"/>
+              </w:rPr>
+            </w:r>
+          </w:p>
+        </w:tc>
+      </w:tr>
+      <w:tr>
+        <w:tc>
+          <w:tcPr>
+            <w:tcW w:type="dxa" w:w="397"/>
+          </w:tcPr>
+          <w:p>
+            <w:pPr>
+              <w:jc w:val="center"/>
+            </w:pPr>
+            <w:r>
+              <w:rPr>
+                <w:rFonts w:ascii="Times New Roman" w:hAnsi="Times New Roman"/>
+                <w:b w:val="0"/>
+                <w:sz w:val="18"/>
+              </w:rPr>
+              <w:t>12</w:t>
+            </w:r>
+          </w:p>
+        </w:tc>
+        <w:tc>
+          <w:tcPr>
+            <w:tcW w:type="dxa" w:w="1417"/>
+          </w:tcPr>
+          <w:p>
+            <w:pPr>
+              <w:jc w:val="center"/>
+            </w:pPr>
+            <w:r>
+              <w:rPr>
+                <w:rFonts w:ascii="Times New Roman" w:hAnsi="Times New Roman"/>
+                <w:b w:val="0"/>
+                <w:sz w:val="18"/>
+              </w:rPr>
+              <w:t>—</w:t>
+            </w:r>
+          </w:p>
+        </w:tc>
+        <w:tc>
+          <w:tcPr>
+            <w:tcW w:type="dxa" w:w="1814"/>
+          </w:tcPr>
+          <w:p>
+            <w:pPr>
+              <w:jc w:val="left"/>
+            </w:pPr>
+            <w:r>
+              <w:rPr>
+                <w:rFonts w:ascii="Times New Roman" w:hAnsi="Times New Roman"/>
+                <w:b w:val="0"/>
+                <w:sz w:val="18"/>
+              </w:rPr>
+              <w:t>ВВГнг-LS</w:t>
+            </w:r>
+          </w:p>
+        </w:tc>
+        <w:tc>
+          <w:tcPr>
+            <w:tcW w:type="dxa" w:w="1417"/>
+          </w:tcPr>
+          <w:p>
+            <w:pPr>
+              <w:jc w:val="center"/>
+            </w:pPr>
+            <w:r>
+              <w:rPr>
+                <w:rFonts w:ascii="Times New Roman" w:hAnsi="Times New Roman"/>
+                <w:b w:val="0"/>
+                <w:sz w:val="18"/>
+              </w:rPr>
+              <w:t>4×1.5</w:t>
+            </w:r>
+          </w:p>
+        </w:tc>
+        <w:tc>
+          <w:tcPr>
+            <w:tcW w:type="dxa" w:w="1984"/>
+          </w:tcPr>
+          <w:p>
+            <w:pPr>
+              <w:jc w:val="center"/>
+            </w:pPr>
+            <w:r>
+              <w:rPr>
+                <w:rFonts w:ascii="Times New Roman" w:hAnsi="Times New Roman"/>
+                <w:b w:val="0"/>
+                <w:sz w:val="18"/>
+              </w:rPr>
+              <w:t>ЩОВ-1</w:t>
+            </w:r>
+          </w:p>
+        </w:tc>
+        <w:tc>
+          <w:tcPr>
+            <w:tcW w:type="dxa" w:w="3118"/>
+          </w:tcPr>
+          <w:p>
+            <w:pPr>
+              <w:jc w:val="left"/>
+            </w:pPr>
+            <w:r>
+              <w:rPr>
+                <w:rFonts w:ascii="Times New Roman" w:hAnsi="Times New Roman"/>
+                <w:b w:val="0"/>
+                <w:sz w:val="18"/>
+              </w:rPr>
+              <w:t>Насос отопления основной</w:t>
+            </w:r>
+          </w:p>
+        </w:tc>
+        <w:tc>
+          <w:tcPr>
+            <w:tcW w:type="dxa" w:w="1134"/>
+          </w:tcPr>
+          <w:p>
+            <w:pPr>
+              <w:jc w:val="center"/>
+            </w:pPr>
+            <w:r>
+              <w:rPr>
+                <w:rFonts w:ascii="Times New Roman" w:hAnsi="Times New Roman"/>
+                <w:b w:val="0"/>
+                <w:sz w:val="18"/>
+              </w:rPr>
+              <w:t>20</w:t>
+            </w:r>
+          </w:p>
+        </w:tc>
+        <w:tc>
+          <w:tcPr>
+            <w:tcW w:type="dxa" w:w="1134"/>
+          </w:tcPr>
+          <w:p>
+            <w:pPr>
+              <w:jc w:val="center"/>
+            </w:pPr>
+            <w:r>
+              <w:rPr>
+                <w:rFonts w:ascii="Times New Roman" w:hAnsi="Times New Roman"/>
+                <w:b w:val="0"/>
+                <w:sz w:val="18"/>
+              </w:rPr>
+              <w:t>24</w:t>
+            </w:r>
+          </w:p>
+        </w:tc>
+        <w:tc>
+          <w:tcPr>
+            <w:tcW w:type="dxa" w:w="1701"/>
+          </w:tcPr>
+          <w:p>
+            <w:pPr>
+              <w:jc w:val="left"/>
+            </w:pPr>
+            <w:r>
+              <w:rPr>
+                <w:rFonts w:ascii="Times New Roman" w:hAnsi="Times New Roman"/>
+                <w:b w:val="0"/>
+                <w:sz w:val="18"/>
+              </w:rPr>
+              <w:t>лоток</w:t>
+            </w:r>
+          </w:p>
+        </w:tc>
+        <w:tc>
+          <w:tcPr>
+            <w:tcW w:type="dxa" w:w="850"/>
+          </w:tcPr>
+          <w:p>
+            <w:pPr>
+              <w:jc w:val="center"/>
+            </w:pPr>
+            <w:r>
+              <w:rPr>
+                <w:rFonts w:ascii="Times New Roman" w:hAnsi="Times New Roman"/>
+                <w:b w:val="0"/>
+                <w:sz w:val="18"/>
+              </w:rPr>
+              <w:t>6</w:t>
+            </w:r>
+          </w:p>
+        </w:tc>
+        <w:tc>
+          <w:tcPr>
+            <w:tcW w:type="dxa" w:w="850"/>
+          </w:tcPr>
+          <w:p>
+            <w:pPr>
+              <w:jc w:val="center"/>
+            </w:pPr>
+            <w:r>
+              <w:rPr>
+                <w:rFonts w:ascii="Times New Roman" w:hAnsi="Times New Roman"/>
+                <w:b w:val="0"/>
+                <w:sz w:val="18"/>
+              </w:rPr>
+              <w:t>0.53</w:t>
+            </w:r>
+          </w:p>
+        </w:tc>
+        <w:tc>
+          <w:tcPr>
+            <w:tcW w:type="dxa" w:w="2268"/>
+          </w:tcPr>
+          <w:p>
+            <w:pPr>
+              <w:jc w:val="left"/>
+            </w:pPr>
+            <w:r>
+              <w:rPr>
+                <w:rFonts w:ascii="Times New Roman" w:hAnsi="Times New Roman"/>
+                <w:b w:val="0"/>
+                <w:sz w:val="18"/>
+              </w:rPr>
+              <w:t>план 20м + запас 20%</w:t>
+            </w:r>
+          </w:p>
+        </w:tc>
+      </w:tr>
+      <w:tr>
+        <w:tc>
+          <w:tcPr>
+            <w:tcW w:type="dxa" w:w="397"/>
+          </w:tcPr>
+          <w:p>
+            <w:pPr>
+              <w:jc w:val="center"/>
+            </w:pPr>
+            <w:r>
+              <w:rPr>
+                <w:rFonts w:ascii="Times New Roman" w:hAnsi="Times New Roman"/>
+                <w:b w:val="0"/>
+                <w:sz w:val="18"/>
+              </w:rPr>
+              <w:t>13</w:t>
+            </w:r>
+          </w:p>
+        </w:tc>
+        <w:tc>
+          <w:tcPr>
+            <w:tcW w:type="dxa" w:w="1417"/>
+          </w:tcPr>
+          <w:p>
+            <w:pPr>
+              <w:jc w:val="center"/>
+            </w:pPr>
+            <w:r>
+              <w:rPr>
+                <w:rFonts w:ascii="Times New Roman" w:hAnsi="Times New Roman"/>
+                <w:b w:val="0"/>
+                <w:sz w:val="18"/>
+              </w:rPr>
+              <w:t>—</w:t>
+            </w:r>
+          </w:p>
+        </w:tc>
+        <w:tc>
+          <w:tcPr>
+            <w:tcW w:type="dxa" w:w="1814"/>
+          </w:tcPr>
+          <w:p>
+            <w:pPr>
+              <w:jc w:val="left"/>
+            </w:pPr>
+            <w:r>
+              <w:rPr>
+                <w:rFonts w:ascii="Times New Roman" w:hAnsi="Times New Roman"/>
+                <w:b w:val="0"/>
+                <w:sz w:val="18"/>
+              </w:rPr>
+              <w:t>ВВГнг-LS</w:t>
+            </w:r>
+          </w:p>
+        </w:tc>
+        <w:tc>
+          <w:tcPr>
+            <w:tcW w:type="dxa" w:w="1417"/>
+          </w:tcPr>
+          <w:p>
+            <w:pPr>
+              <w:jc w:val="center"/>
+            </w:pPr>
+            <w:r>
+              <w:rPr>
+                <w:rFonts w:ascii="Times New Roman" w:hAnsi="Times New Roman"/>
+                <w:b w:val="0"/>
+                <w:sz w:val="18"/>
+              </w:rPr>
+              <w:t>4×1.5</w:t>
+            </w:r>
+          </w:p>
+        </w:tc>
+        <w:tc>
+          <w:tcPr>
+            <w:tcW w:type="dxa" w:w="1984"/>
+          </w:tcPr>
+          <w:p>
+            <w:pPr>
+              <w:jc w:val="center"/>
+            </w:pPr>
+            <w:r>
+              <w:rPr>
+                <w:rFonts w:ascii="Times New Roman" w:hAnsi="Times New Roman"/>
+                <w:b w:val="0"/>
+                <w:sz w:val="18"/>
+              </w:rPr>
+              <w:t>ЩОВ-1</w:t>
+            </w:r>
+          </w:p>
+        </w:tc>
+        <w:tc>
+          <w:tcPr>
+            <w:tcW w:type="dxa" w:w="3118"/>
+          </w:tcPr>
+          <w:p>
+            <w:pPr>
+              <w:jc w:val="left"/>
+            </w:pPr>
+            <w:r>
+              <w:rPr>
+                <w:rFonts w:ascii="Times New Roman" w:hAnsi="Times New Roman"/>
+                <w:b w:val="0"/>
+                <w:sz w:val="18"/>
+              </w:rPr>
+              <w:t>Насос отопления резервный</w:t>
+            </w:r>
+          </w:p>
+        </w:tc>
+        <w:tc>
+          <w:tcPr>
+            <w:tcW w:type="dxa" w:w="1134"/>
+          </w:tcPr>
+          <w:p>
+            <w:pPr>
+              <w:jc w:val="center"/>
+            </w:pPr>
+            <w:r>
+              <w:rPr>
+                <w:rFonts w:ascii="Times New Roman" w:hAnsi="Times New Roman"/>
+                <w:b w:val="0"/>
+                <w:sz w:val="18"/>
+              </w:rPr>
+              <w:t>20</w:t>
+            </w:r>
+          </w:p>
+        </w:tc>
+        <w:tc>
+          <w:tcPr>
+            <w:tcW w:type="dxa" w:w="1134"/>
+          </w:tcPr>
+          <w:p>
+            <w:pPr>
+              <w:jc w:val="center"/>
+            </w:pPr>
+            <w:r>
+              <w:rPr>
+                <w:rFonts w:ascii="Times New Roman" w:hAnsi="Times New Roman"/>
+                <w:b w:val="0"/>
+                <w:sz w:val="18"/>
+              </w:rPr>
+              <w:t>24</w:t>
+            </w:r>
+          </w:p>
+        </w:tc>
+        <w:tc>
+          <w:tcPr>
+            <w:tcW w:type="dxa" w:w="1701"/>
+          </w:tcPr>
+          <w:p>
+            <w:pPr>
+              <w:jc w:val="left"/>
+            </w:pPr>
+            <w:r>
+              <w:rPr>
+                <w:rFonts w:ascii="Times New Roman" w:hAnsi="Times New Roman"/>
+                <w:b w:val="0"/>
+                <w:sz w:val="18"/>
+              </w:rPr>
+              <w:t>лоток</w:t>
+            </w:r>
+          </w:p>
+        </w:tc>
+        <w:tc>
+          <w:tcPr>
+            <w:tcW w:type="dxa" w:w="850"/>
+          </w:tcPr>
+          <w:p>
+            <w:pPr>
+              <w:jc w:val="center"/>
+            </w:pPr>
+            <w:r>
+              <w:rPr>
+                <w:rFonts w:ascii="Times New Roman" w:hAnsi="Times New Roman"/>
+                <w:b w:val="0"/>
+                <w:sz w:val="18"/>
+              </w:rPr>
+              <w:t>6</w:t>
+            </w:r>
+          </w:p>
+        </w:tc>
+        <w:tc>
+          <w:tcPr>
+            <w:tcW w:type="dxa" w:w="850"/>
+          </w:tcPr>
+          <w:p>
+            <w:pPr>
+              <w:jc w:val="center"/>
+            </w:pPr>
+            <w:r>
+              <w:rPr>
+                <w:rFonts w:ascii="Times New Roman" w:hAnsi="Times New Roman"/>
+                <w:b w:val="0"/>
+                <w:sz w:val="18"/>
+              </w:rPr>
+              <w:t>0.53</w:t>
+            </w:r>
+          </w:p>
+        </w:tc>
+        <w:tc>
+          <w:tcPr>
+            <w:tcW w:type="dxa" w:w="2268"/>
+          </w:tcPr>
+          <w:p>
+            <w:pPr>
+              <w:jc w:val="left"/>
+            </w:pPr>
+            <w:r>
+              <w:rPr>
+                <w:rFonts w:ascii="Times New Roman" w:hAnsi="Times New Roman"/>
+                <w:b w:val="0"/>
+                <w:sz w:val="18"/>
+              </w:rPr>
+              <w:t>резерв; план 20м + запас 20%</w:t>
+            </w:r>
+          </w:p>
+        </w:tc>
+      </w:tr>
+      <w:tr>
+        <w:tc>
+          <w:tcPr>
+            <w:tcW w:type="dxa" w:w="22104"/>
+            <w:gridSpan w:val="12"/>
+          </w:tcPr>
+          <w:p>
+            <w:pPr>
+              <w:jc w:val="left"/>
+            </w:pPr>
+            <w:r>
+              <w:rPr>
+                <w:rFonts w:ascii="Times New Roman" w:hAnsi="Times New Roman"/>
+                <w:b/>
+                <w:sz w:val="18"/>
+              </w:rPr>
+              <w:t xml:space="preserve">  Раздел: ВК</w:t>
+            </w:r>
+          </w:p>
+        </w:tc>
+      </w:tr>
+      <w:tr>
+        <w:tc>
+          <w:tcPr>
+            <w:tcW w:type="dxa" w:w="397"/>
+          </w:tcPr>
+          <w:p>
+            <w:pPr>
+              <w:jc w:val="center"/>
+            </w:pPr>
+            <w:r>
+              <w:rPr>
+                <w:rFonts w:ascii="Times New Roman" w:hAnsi="Times New Roman"/>
+                <w:b w:val="0"/>
+                <w:sz w:val="18"/>
+              </w:rPr>
+              <w:t>14</w:t>
+            </w:r>
+          </w:p>
+        </w:tc>
+        <w:tc>
+          <w:tcPr>
+            <w:tcW w:type="dxa" w:w="1417"/>
+          </w:tcPr>
+          <w:p>
+            <w:pPr>
+              <w:jc w:val="center"/>
+            </w:pPr>
+            <w:r>
+              <w:rPr>
+                <w:rFonts w:ascii="Times New Roman" w:hAnsi="Times New Roman"/>
+                <w:b w:val="0"/>
+                <w:sz w:val="18"/>
+              </w:rPr>
+              <w:t>—</w:t>
+            </w:r>
+          </w:p>
+        </w:tc>
+        <w:tc>
+          <w:tcPr>
+            <w:tcW w:type="dxa" w:w="1814"/>
+          </w:tcPr>
+          <w:p>
+            <w:pPr>
+              <w:jc w:val="left"/>
+            </w:pPr>
+            <w:r>
+              <w:rPr>
+                <w:rFonts w:ascii="Times New Roman" w:hAnsi="Times New Roman"/>
+                <w:b w:val="0"/>
+                <w:sz w:val="18"/>
+              </w:rPr>
+              <w:t>ВВГнг-LS</w:t>
+            </w:r>
+          </w:p>
+        </w:tc>
+        <w:tc>
+          <w:tcPr>
+            <w:tcW w:type="dxa" w:w="1417"/>
+          </w:tcPr>
+          <w:p>
+            <w:pPr>
+              <w:jc w:val="center"/>
+            </w:pPr>
+            <w:r>
+              <w:rPr>
+                <w:rFonts w:ascii="Times New Roman" w:hAnsi="Times New Roman"/>
+                <w:b w:val="0"/>
+                <w:sz w:val="18"/>
+              </w:rPr>
+              <w:t>4×1.5</w:t>
+            </w:r>
+          </w:p>
+        </w:tc>
+        <w:tc>
+          <w:tcPr>
+            <w:tcW w:type="dxa" w:w="1984"/>
+          </w:tcPr>
+          <w:p>
+            <w:pPr>
+              <w:jc w:val="center"/>
+            </w:pPr>
+            <w:r>
+              <w:rPr>
+                <w:rFonts w:ascii="Times New Roman" w:hAnsi="Times New Roman"/>
+                <w:b w:val="0"/>
+                <w:sz w:val="18"/>
+              </w:rPr>
+              <w:t>ВРУ-1</w:t>
+            </w:r>
+          </w:p>
+        </w:tc>
+        <w:tc>
+          <w:tcPr>
+            <w:tcW w:type="dxa" w:w="3118"/>
+          </w:tcPr>
+          <w:p>
+            <w:pPr>
+              <w:jc w:val="left"/>
+            </w:pPr>
+            <w:r>
+              <w:rPr>
+                <w:rFonts w:ascii="Times New Roman" w:hAnsi="Times New Roman"/>
+                <w:b w:val="0"/>
+                <w:sz w:val="18"/>
+              </w:rPr>
+              <w:t>Щит вентиляции №1</w:t>
+            </w:r>
+          </w:p>
+        </w:tc>
+        <w:tc>
+          <w:tcPr>
+            <w:tcW w:type="dxa" w:w="1134"/>
+          </w:tcPr>
+          <w:p>
+            <w:pPr>
+              <w:jc w:val="center"/>
+            </w:pPr>
+            <w:r>
+              <w:rPr>
+                <w:rFonts w:ascii="Times New Roman" w:hAnsi="Times New Roman"/>
+                <w:b w:val="0"/>
+                <w:sz w:val="18"/>
+              </w:rPr>
+              <w:t>35</w:t>
+            </w:r>
+          </w:p>
+        </w:tc>
+        <w:tc>
+          <w:tcPr>
+            <w:tcW w:type="dxa" w:w="1134"/>
+          </w:tcPr>
+          <w:p>
+            <w:pPr>
+              <w:jc w:val="center"/>
+            </w:pPr>
+            <w:r>
+              <w:rPr>
+                <w:rFonts w:ascii="Times New Roman" w:hAnsi="Times New Roman"/>
+                <w:b w:val="0"/>
+                <w:sz w:val="18"/>
+              </w:rPr>
+              <w:t>35</w:t>
+            </w:r>
+          </w:p>
+        </w:tc>
+        <w:tc>
+          <w:tcPr>
+            <w:tcW w:type="dxa" w:w="1701"/>
+          </w:tcPr>
+          <w:p>
+            <w:pPr>
+              <w:jc w:val="left"/>
+            </w:pPr>
+            <w:r>
+              <w:rPr>
+                <w:rFonts w:ascii="Times New Roman" w:hAnsi="Times New Roman"/>
+                <w:b w:val="0"/>
+                <w:sz w:val="18"/>
+              </w:rPr>
+              <w:t>лоток</w:t>
+            </w:r>
+          </w:p>
+        </w:tc>
+        <w:tc>
+          <w:tcPr>
+            <w:tcW w:type="dxa" w:w="850"/>
+          </w:tcPr>
+          <w:p>
+            <w:pPr>
+              <w:jc w:val="center"/>
+            </w:pPr>
+            <w:r>
+              <w:rPr>
+                <w:rFonts w:ascii="Times New Roman" w:hAnsi="Times New Roman"/>
+                <w:b w:val="0"/>
+                <w:sz w:val="18"/>
+              </w:rPr>
+              <w:t>16</w:t>
+            </w:r>
+          </w:p>
+        </w:tc>
+        <w:tc>
+          <w:tcPr>
+            <w:tcW w:type="dxa" w:w="850"/>
+          </w:tcPr>
+          <w:p>
+            <w:pPr>
+              <w:jc w:val="center"/>
+            </w:pPr>
+            <w:r>
+              <w:rPr>
+                <w:rFonts w:ascii="Times New Roman" w:hAnsi="Times New Roman"/>
+                <w:b w:val="0"/>
+                <w:sz w:val="18"/>
+              </w:rPr>
+              <w:t>2.46</w:t>
+            </w:r>
+          </w:p>
+        </w:tc>
+        <w:tc>
+          <w:tcPr>
+            <w:tcW w:type="dxa" w:w="2268"/>
+          </w:tcPr>
+          <w:p>
+            <w:pPr>
+              <w:jc w:val="left"/>
+            </w:pPr>
+            <w:r>
+              <w:rPr>
+                <w:rFonts w:ascii="Times New Roman" w:hAnsi="Times New Roman"/>
+                <w:b w:val="0"/>
+                <w:sz w:val="18"/>
+              </w:rPr>
+            </w:r>
+          </w:p>
+        </w:tc>
+      </w:tr>
+      <w:tr>
+        <w:tc>
+          <w:tcPr>
+            <w:tcW w:type="dxa" w:w="397"/>
+          </w:tcPr>
+          <w:p>
+            <w:pPr>
+              <w:jc w:val="center"/>
+            </w:pPr>
+            <w:r>
+              <w:rPr>
+                <w:rFonts w:ascii="Times New Roman" w:hAnsi="Times New Roman"/>
+                <w:b w:val="0"/>
+                <w:sz w:val="18"/>
+              </w:rPr>
+              <w:t>15</w:t>
+            </w:r>
+          </w:p>
+        </w:tc>
+        <w:tc>
+          <w:tcPr>
+            <w:tcW w:type="dxa" w:w="1417"/>
+          </w:tcPr>
+          <w:p>
+            <w:pPr>
+              <w:jc w:val="center"/>
+            </w:pPr>
+            <w:r>
+              <w:rPr>
+                <w:rFonts w:ascii="Times New Roman" w:hAnsi="Times New Roman"/>
+                <w:b w:val="0"/>
+                <w:sz w:val="18"/>
+              </w:rPr>
+              <w:t>—</w:t>
+            </w:r>
+          </w:p>
+        </w:tc>
+        <w:tc>
+          <w:tcPr>
+            <w:tcW w:type="dxa" w:w="1814"/>
+          </w:tcPr>
+          <w:p>
+            <w:pPr>
+              <w:jc w:val="left"/>
+            </w:pPr>
+            <w:r>
+              <w:rPr>
+                <w:rFonts w:ascii="Times New Roman" w:hAnsi="Times New Roman"/>
+                <w:b w:val="0"/>
+                <w:sz w:val="18"/>
+              </w:rPr>
+              <w:t>ВВГнг-LS</w:t>
+            </w:r>
+          </w:p>
+        </w:tc>
+        <w:tc>
+          <w:tcPr>
+            <w:tcW w:type="dxa" w:w="1417"/>
+          </w:tcPr>
+          <w:p>
+            <w:pPr>
+              <w:jc w:val="center"/>
+            </w:pPr>
+            <w:r>
+              <w:rPr>
+                <w:rFonts w:ascii="Times New Roman" w:hAnsi="Times New Roman"/>
+                <w:b w:val="0"/>
+                <w:sz w:val="18"/>
+              </w:rPr>
+              <w:t>4×1.5</w:t>
+            </w:r>
+          </w:p>
+        </w:tc>
+        <w:tc>
+          <w:tcPr>
+            <w:tcW w:type="dxa" w:w="1984"/>
+          </w:tcPr>
+          <w:p>
+            <w:pPr>
+              <w:jc w:val="center"/>
+            </w:pPr>
+            <w:r>
+              <w:rPr>
+                <w:rFonts w:ascii="Times New Roman" w:hAnsi="Times New Roman"/>
+                <w:b w:val="0"/>
+                <w:sz w:val="18"/>
+              </w:rPr>
+              <w:t>ЩВК-1</w:t>
+            </w:r>
+          </w:p>
+        </w:tc>
+        <w:tc>
+          <w:tcPr>
+            <w:tcW w:type="dxa" w:w="3118"/>
+          </w:tcPr>
+          <w:p>
+            <w:pPr>
+              <w:jc w:val="left"/>
+            </w:pPr>
+            <w:r>
+              <w:rPr>
+                <w:rFonts w:ascii="Times New Roman" w:hAnsi="Times New Roman"/>
+                <w:b w:val="0"/>
+                <w:sz w:val="18"/>
+              </w:rPr>
+              <w:t>Приточная вентустановка</w:t>
+            </w:r>
+          </w:p>
+        </w:tc>
+        <w:tc>
+          <w:tcPr>
+            <w:tcW w:type="dxa" w:w="1134"/>
+          </w:tcPr>
+          <w:p>
+            <w:pPr>
+              <w:jc w:val="center"/>
+            </w:pPr>
+            <w:r>
+              <w:rPr>
+                <w:rFonts w:ascii="Times New Roman" w:hAnsi="Times New Roman"/>
+                <w:b w:val="0"/>
+                <w:sz w:val="18"/>
+              </w:rPr>
+              <w:t>25</w:t>
+            </w:r>
+          </w:p>
+        </w:tc>
+        <w:tc>
+          <w:tcPr>
+            <w:tcW w:type="dxa" w:w="1134"/>
+          </w:tcPr>
+          <w:p>
+            <w:pPr>
+              <w:jc w:val="center"/>
+            </w:pPr>
+            <w:r>
+              <w:rPr>
+                <w:rFonts w:ascii="Times New Roman" w:hAnsi="Times New Roman"/>
+                <w:b w:val="0"/>
+                <w:sz w:val="18"/>
+              </w:rPr>
+              <w:t>30</w:t>
+            </w:r>
+          </w:p>
+        </w:tc>
+        <w:tc>
+          <w:tcPr>
+            <w:tcW w:type="dxa" w:w="1701"/>
+          </w:tcPr>
+          <w:p>
+            <w:pPr>
+              <w:jc w:val="left"/>
+            </w:pPr>
+            <w:r>
+              <w:rPr>
+                <w:rFonts w:ascii="Times New Roman" w:hAnsi="Times New Roman"/>
+                <w:b w:val="0"/>
+                <w:sz w:val="18"/>
+              </w:rPr>
+              <w:t>лоток</w:t>
+            </w:r>
+          </w:p>
+        </w:tc>
+        <w:tc>
+          <w:tcPr>
+            <w:tcW w:type="dxa" w:w="850"/>
+          </w:tcPr>
+          <w:p>
+            <w:pPr>
+              <w:jc w:val="center"/>
+            </w:pPr>
+            <w:r>
+              <w:rPr>
+                <w:rFonts w:ascii="Times New Roman" w:hAnsi="Times New Roman"/>
+                <w:b w:val="0"/>
+                <w:sz w:val="18"/>
+              </w:rPr>
+              <w:t>10</w:t>
+            </w:r>
+          </w:p>
+        </w:tc>
+        <w:tc>
+          <w:tcPr>
+            <w:tcW w:type="dxa" w:w="850"/>
+          </w:tcPr>
+          <w:p>
+            <w:pPr>
+              <w:jc w:val="center"/>
+            </w:pPr>
+            <w:r>
+              <w:rPr>
+                <w:rFonts w:ascii="Times New Roman" w:hAnsi="Times New Roman"/>
+                <w:b w:val="0"/>
+                <w:sz w:val="18"/>
+              </w:rPr>
+              <w:t>1.22</w:t>
+            </w:r>
+          </w:p>
+        </w:tc>
+        <w:tc>
+          <w:tcPr>
+            <w:tcW w:type="dxa" w:w="2268"/>
+          </w:tcPr>
+          <w:p>
+            <w:pPr>
+              <w:jc w:val="left"/>
+            </w:pPr>
+            <w:r>
+              <w:rPr>
+                <w:rFonts w:ascii="Times New Roman" w:hAnsi="Times New Roman"/>
+                <w:b w:val="0"/>
+                <w:sz w:val="18"/>
+              </w:rPr>
+              <w:t>план 25м + запас 20%</w:t>
+            </w:r>
+          </w:p>
+        </w:tc>
+      </w:tr>
+      <w:tr>
+        <w:tc>
+          <w:tcPr>
+            <w:tcW w:type="dxa" w:w="397"/>
+          </w:tcPr>
+          <w:p>
+            <w:pPr>
+              <w:jc w:val="center"/>
+            </w:pPr>
+            <w:r>
+              <w:rPr>
+                <w:rFonts w:ascii="Times New Roman" w:hAnsi="Times New Roman"/>
+                <w:b w:val="0"/>
+                <w:sz w:val="18"/>
+              </w:rPr>
+              <w:t>16</w:t>
+            </w:r>
+          </w:p>
+        </w:tc>
+        <w:tc>
+          <w:tcPr>
+            <w:tcW w:type="dxa" w:w="1417"/>
+          </w:tcPr>
+          <w:p>
+            <w:pPr>
+              <w:jc w:val="center"/>
+            </w:pPr>
+            <w:r>
+              <w:rPr>
+                <w:rFonts w:ascii="Times New Roman" w:hAnsi="Times New Roman"/>
+                <w:b w:val="0"/>
+                <w:sz w:val="18"/>
+              </w:rPr>
+              <w:t>—</w:t>
+            </w:r>
+          </w:p>
+        </w:tc>
+        <w:tc>
+          <w:tcPr>
+            <w:tcW w:type="dxa" w:w="1814"/>
+          </w:tcPr>
+          <w:p>
+            <w:pPr>
+              <w:jc w:val="left"/>
+            </w:pPr>
+            <w:r>
+              <w:rPr>
+                <w:rFonts w:ascii="Times New Roman" w:hAnsi="Times New Roman"/>
+                <w:b w:val="0"/>
+                <w:sz w:val="18"/>
+              </w:rPr>
+              <w:t>ВВГнг-LS</w:t>
+            </w:r>
+          </w:p>
+        </w:tc>
+        <w:tc>
+          <w:tcPr>
+            <w:tcW w:type="dxa" w:w="1417"/>
+          </w:tcPr>
+          <w:p>
+            <w:pPr>
+              <w:jc w:val="center"/>
+            </w:pPr>
+            <w:r>
+              <w:rPr>
+                <w:rFonts w:ascii="Times New Roman" w:hAnsi="Times New Roman"/>
+                <w:b w:val="0"/>
+                <w:sz w:val="18"/>
+              </w:rPr>
+              <w:t>4×1.5</w:t>
+            </w:r>
+          </w:p>
+        </w:tc>
+        <w:tc>
+          <w:tcPr>
+            <w:tcW w:type="dxa" w:w="1984"/>
+          </w:tcPr>
+          <w:p>
+            <w:pPr>
+              <w:jc w:val="center"/>
+            </w:pPr>
+            <w:r>
+              <w:rPr>
+                <w:rFonts w:ascii="Times New Roman" w:hAnsi="Times New Roman"/>
+                <w:b w:val="0"/>
+                <w:sz w:val="18"/>
+              </w:rPr>
+              <w:t>ЩВК-1</w:t>
+            </w:r>
+          </w:p>
+        </w:tc>
+        <w:tc>
+          <w:tcPr>
+            <w:tcW w:type="dxa" w:w="3118"/>
+          </w:tcPr>
+          <w:p>
+            <w:pPr>
+              <w:jc w:val="left"/>
+            </w:pPr>
+            <w:r>
+              <w:rPr>
+                <w:rFonts w:ascii="Times New Roman" w:hAnsi="Times New Roman"/>
+                <w:b w:val="0"/>
+                <w:sz w:val="18"/>
+              </w:rPr>
+              <w:t>Вытяжная вентустановка</w:t>
+            </w:r>
+          </w:p>
+        </w:tc>
+        <w:tc>
+          <w:tcPr>
+            <w:tcW w:type="dxa" w:w="1134"/>
+          </w:tcPr>
+          <w:p>
+            <w:pPr>
+              <w:jc w:val="center"/>
+            </w:pPr>
+            <w:r>
+              <w:rPr>
+                <w:rFonts w:ascii="Times New Roman" w:hAnsi="Times New Roman"/>
+                <w:b w:val="0"/>
+                <w:sz w:val="18"/>
+              </w:rPr>
+              <w:t>30</w:t>
+            </w:r>
+          </w:p>
+        </w:tc>
+        <w:tc>
+          <w:tcPr>
+            <w:tcW w:type="dxa" w:w="1134"/>
+          </w:tcPr>
+          <w:p>
+            <w:pPr>
+              <w:jc w:val="center"/>
+            </w:pPr>
+            <w:r>
+              <w:rPr>
+                <w:rFonts w:ascii="Times New Roman" w:hAnsi="Times New Roman"/>
+                <w:b w:val="0"/>
+                <w:sz w:val="18"/>
+              </w:rPr>
+              <w:t>36</w:t>
+            </w:r>
+          </w:p>
+        </w:tc>
+        <w:tc>
+          <w:tcPr>
+            <w:tcW w:type="dxa" w:w="1701"/>
+          </w:tcPr>
+          <w:p>
+            <w:pPr>
+              <w:jc w:val="left"/>
+            </w:pPr>
+            <w:r>
+              <w:rPr>
+                <w:rFonts w:ascii="Times New Roman" w:hAnsi="Times New Roman"/>
+                <w:b w:val="0"/>
+                <w:sz w:val="18"/>
+              </w:rPr>
+              <w:t>лоток</w:t>
+            </w:r>
+          </w:p>
+        </w:tc>
+        <w:tc>
+          <w:tcPr>
+            <w:tcW w:type="dxa" w:w="850"/>
+          </w:tcPr>
+          <w:p>
+            <w:pPr>
+              <w:jc w:val="center"/>
+            </w:pPr>
+            <w:r>
+              <w:rPr>
+                <w:rFonts w:ascii="Times New Roman" w:hAnsi="Times New Roman"/>
+                <w:b w:val="0"/>
+                <w:sz w:val="18"/>
+              </w:rPr>
+              <w:t>10</w:t>
+            </w:r>
+          </w:p>
+        </w:tc>
+        <w:tc>
+          <w:tcPr>
+            <w:tcW w:type="dxa" w:w="850"/>
+          </w:tcPr>
+          <w:p>
+            <w:pPr>
+              <w:jc w:val="center"/>
+            </w:pPr>
+            <w:r>
+              <w:rPr>
+                <w:rFonts w:ascii="Times New Roman" w:hAnsi="Times New Roman"/>
+                <w:b w:val="0"/>
+                <w:sz w:val="18"/>
+              </w:rPr>
+              <w:t>1.07</w:t>
+            </w:r>
+          </w:p>
+        </w:tc>
+        <w:tc>
+          <w:tcPr>
+            <w:tcW w:type="dxa" w:w="2268"/>
+          </w:tcPr>
+          <w:p>
+            <w:pPr>
+              <w:jc w:val="left"/>
+            </w:pPr>
+            <w:r>
+              <w:rPr>
+                <w:rFonts w:ascii="Times New Roman" w:hAnsi="Times New Roman"/>
+                <w:b w:val="0"/>
+                <w:sz w:val="18"/>
+              </w:rPr>
+              <w:t>план 30м + запас 20%</w:t>
+            </w:r>
+          </w:p>
+        </w:tc>
+      </w:tr>
+      <w:tr>
+        <w:tc>
+          <w:tcPr>
+            <w:tcW w:type="dxa" w:w="397"/>
+          </w:tcPr>
+          <w:p>
+            <w:pPr>
+              <w:jc w:val="center"/>
+            </w:pPr>
+            <w:r>
+              <w:rPr>
+                <w:rFonts w:ascii="Times New Roman" w:hAnsi="Times New Roman"/>
+                <w:b w:val="0"/>
+                <w:sz w:val="18"/>
+              </w:rPr>
+              <w:t>17</w:t>
+            </w:r>
+          </w:p>
+        </w:tc>
+        <w:tc>
+          <w:tcPr>
+            <w:tcW w:type="dxa" w:w="1417"/>
+          </w:tcPr>
+          <w:p>
+            <w:pPr>
+              <w:jc w:val="center"/>
+            </w:pPr>
+            <w:r>
+              <w:rPr>
+                <w:rFonts w:ascii="Times New Roman" w:hAnsi="Times New Roman"/>
+                <w:b w:val="0"/>
+                <w:sz w:val="18"/>
+              </w:rPr>
+              <w:t>—</w:t>
+            </w:r>
+          </w:p>
+        </w:tc>
+        <w:tc>
+          <w:tcPr>
+            <w:tcW w:type="dxa" w:w="1814"/>
+          </w:tcPr>
+          <w:p>
+            <w:pPr>
+              <w:jc w:val="left"/>
+            </w:pPr>
+            <w:r>
+              <w:rPr>
+                <w:rFonts w:ascii="Times New Roman" w:hAnsi="Times New Roman"/>
+                <w:b w:val="0"/>
+                <w:sz w:val="18"/>
+              </w:rPr>
+              <w:t>ВВГнг-FRLS</w:t>
+            </w:r>
+          </w:p>
+        </w:tc>
+        <w:tc>
+          <w:tcPr>
+            <w:tcW w:type="dxa" w:w="1417"/>
+          </w:tcPr>
+          <w:p>
+            <w:pPr>
+              <w:jc w:val="center"/>
+            </w:pPr>
+            <w:r>
+              <w:rPr>
+                <w:rFonts w:ascii="Times New Roman" w:hAnsi="Times New Roman"/>
+                <w:b w:val="0"/>
+                <w:sz w:val="18"/>
+              </w:rPr>
+              <w:t>4×1.5</w:t>
+            </w:r>
+          </w:p>
+        </w:tc>
+        <w:tc>
+          <w:tcPr>
+            <w:tcW w:type="dxa" w:w="1984"/>
+          </w:tcPr>
+          <w:p>
+            <w:pPr>
+              <w:jc w:val="center"/>
+            </w:pPr>
+            <w:r>
+              <w:rPr>
+                <w:rFonts w:ascii="Times New Roman" w:hAnsi="Times New Roman"/>
+                <w:b w:val="0"/>
+                <w:sz w:val="18"/>
+              </w:rPr>
+              <w:t>ВРУ-1</w:t>
+            </w:r>
+          </w:p>
+        </w:tc>
+        <w:tc>
+          <w:tcPr>
+            <w:tcW w:type="dxa" w:w="3118"/>
+          </w:tcPr>
+          <w:p>
+            <w:pPr>
+              <w:jc w:val="left"/>
+            </w:pPr>
+            <w:r>
+              <w:rPr>
+                <w:rFonts w:ascii="Times New Roman" w:hAnsi="Times New Roman"/>
+                <w:b w:val="0"/>
+                <w:sz w:val="18"/>
+              </w:rPr>
+              <w:t>Щит дымоудаления №1</w:t>
+            </w:r>
+          </w:p>
+        </w:tc>
+        <w:tc>
+          <w:tcPr>
+            <w:tcW w:type="dxa" w:w="1134"/>
+          </w:tcPr>
+          <w:p>
+            <w:pPr>
+              <w:jc w:val="center"/>
+            </w:pPr>
+            <w:r>
+              <w:rPr>
+                <w:rFonts w:ascii="Times New Roman" w:hAnsi="Times New Roman"/>
+                <w:b w:val="0"/>
+                <w:sz w:val="18"/>
+              </w:rPr>
+              <w:t>40</w:t>
+            </w:r>
+          </w:p>
+        </w:tc>
+        <w:tc>
+          <w:tcPr>
+            <w:tcW w:type="dxa" w:w="1134"/>
+          </w:tcPr>
+          <w:p>
+            <w:pPr>
+              <w:jc w:val="center"/>
+            </w:pPr>
+            <w:r>
+              <w:rPr>
+                <w:rFonts w:ascii="Times New Roman" w:hAnsi="Times New Roman"/>
+                <w:b w:val="0"/>
+                <w:sz w:val="18"/>
+              </w:rPr>
+              <w:t>40</w:t>
+            </w:r>
+          </w:p>
+        </w:tc>
+        <w:tc>
+          <w:tcPr>
+            <w:tcW w:type="dxa" w:w="1701"/>
+          </w:tcPr>
+          <w:p>
+            <w:pPr>
+              <w:jc w:val="left"/>
+            </w:pPr>
+            <w:r>
+              <w:rPr>
+                <w:rFonts w:ascii="Times New Roman" w:hAnsi="Times New Roman"/>
+                <w:b w:val="0"/>
+                <w:sz w:val="18"/>
+              </w:rPr>
+              <w:t>лоток</w:t>
+            </w:r>
+          </w:p>
+        </w:tc>
+        <w:tc>
+          <w:tcPr>
+            <w:tcW w:type="dxa" w:w="850"/>
+          </w:tcPr>
+          <w:p>
+            <w:pPr>
+              <w:jc w:val="center"/>
+            </w:pPr>
+            <w:r>
+              <w:rPr>
+                <w:rFonts w:ascii="Times New Roman" w:hAnsi="Times New Roman"/>
+                <w:b w:val="0"/>
+                <w:sz w:val="18"/>
+              </w:rPr>
+              <w:t>16</w:t>
+            </w:r>
+          </w:p>
+        </w:tc>
+        <w:tc>
+          <w:tcPr>
+            <w:tcW w:type="dxa" w:w="850"/>
+          </w:tcPr>
+          <w:p>
+            <w:pPr>
+              <w:jc w:val="center"/>
+            </w:pPr>
+            <w:r>
+              <w:rPr>
+                <w:rFonts w:ascii="Times New Roman" w:hAnsi="Times New Roman"/>
+                <w:b w:val="0"/>
+                <w:sz w:val="18"/>
+              </w:rPr>
+              <w:t>2.78</w:t>
+            </w:r>
+          </w:p>
+        </w:tc>
+        <w:tc>
+          <w:tcPr>
+            <w:tcW w:type="dxa" w:w="2268"/>
+          </w:tcPr>
+          <w:p>
+            <w:pPr>
+              <w:jc w:val="left"/>
+            </w:pPr>
+            <w:r>
+              <w:rPr>
+                <w:rFonts w:ascii="Times New Roman" w:hAnsi="Times New Roman"/>
+                <w:b w:val="0"/>
+                <w:sz w:val="18"/>
+              </w:rPr>
+            </w:r>
+          </w:p>
+        </w:tc>
+      </w:tr>
+      <w:tr>
+        <w:tc>
+          <w:tcPr>
+            <w:tcW w:type="dxa" w:w="397"/>
+          </w:tcPr>
+          <w:p>
+            <w:pPr>
+              <w:jc w:val="center"/>
+            </w:pPr>
+            <w:r>
+              <w:rPr>
+                <w:rFonts w:ascii="Times New Roman" w:hAnsi="Times New Roman"/>
+                <w:b w:val="0"/>
+                <w:sz w:val="18"/>
+              </w:rPr>
+              <w:t>18</w:t>
+            </w:r>
+          </w:p>
+        </w:tc>
+        <w:tc>
+          <w:tcPr>
+            <w:tcW w:type="dxa" w:w="1417"/>
+          </w:tcPr>
+          <w:p>
+            <w:pPr>
+              <w:jc w:val="center"/>
+            </w:pPr>
+            <w:r>
+              <w:rPr>
+                <w:rFonts w:ascii="Times New Roman" w:hAnsi="Times New Roman"/>
+                <w:b w:val="0"/>
+                <w:sz w:val="18"/>
+              </w:rPr>
+              <w:t>—</w:t>
+            </w:r>
+          </w:p>
+        </w:tc>
+        <w:tc>
+          <w:tcPr>
+            <w:tcW w:type="dxa" w:w="1814"/>
+          </w:tcPr>
+          <w:p>
+            <w:pPr>
+              <w:jc w:val="left"/>
+            </w:pPr>
+            <w:r>
+              <w:rPr>
+                <w:rFonts w:ascii="Times New Roman" w:hAnsi="Times New Roman"/>
+                <w:b w:val="0"/>
+                <w:sz w:val="18"/>
+              </w:rPr>
+              <w:t>ВВГнг-FRLS</w:t>
+            </w:r>
+          </w:p>
+        </w:tc>
+        <w:tc>
+          <w:tcPr>
+            <w:tcW w:type="dxa" w:w="1417"/>
+          </w:tcPr>
+          <w:p>
+            <w:pPr>
+              <w:jc w:val="center"/>
+            </w:pPr>
+            <w:r>
+              <w:rPr>
+                <w:rFonts w:ascii="Times New Roman" w:hAnsi="Times New Roman"/>
+                <w:b w:val="0"/>
+                <w:sz w:val="18"/>
+              </w:rPr>
+              <w:t>4×1.5</w:t>
+            </w:r>
+          </w:p>
+        </w:tc>
+        <w:tc>
+          <w:tcPr>
+            <w:tcW w:type="dxa" w:w="1984"/>
+          </w:tcPr>
+          <w:p>
+            <w:pPr>
+              <w:jc w:val="center"/>
+            </w:pPr>
+            <w:r>
+              <w:rPr>
+                <w:rFonts w:ascii="Times New Roman" w:hAnsi="Times New Roman"/>
+                <w:b w:val="0"/>
+                <w:sz w:val="18"/>
+              </w:rPr>
+              <w:t>ЩДУ-1</w:t>
+            </w:r>
+          </w:p>
+        </w:tc>
+        <w:tc>
+          <w:tcPr>
+            <w:tcW w:type="dxa" w:w="3118"/>
+          </w:tcPr>
+          <w:p>
+            <w:pPr>
+              <w:jc w:val="left"/>
+            </w:pPr>
+            <w:r>
+              <w:rPr>
+                <w:rFonts w:ascii="Times New Roman" w:hAnsi="Times New Roman"/>
+                <w:b w:val="0"/>
+                <w:sz w:val="18"/>
+              </w:rPr>
+              <w:t>Вентилятор дымоудаления</w:t>
+            </w:r>
+          </w:p>
+        </w:tc>
+        <w:tc>
+          <w:tcPr>
+            <w:tcW w:type="dxa" w:w="1134"/>
+          </w:tcPr>
+          <w:p>
+            <w:pPr>
+              <w:jc w:val="center"/>
+            </w:pPr>
+            <w:r>
+              <w:rPr>
+                <w:rFonts w:ascii="Times New Roman" w:hAnsi="Times New Roman"/>
+                <w:b w:val="0"/>
+                <w:sz w:val="18"/>
+              </w:rPr>
+              <w:t>35</w:t>
+            </w:r>
+          </w:p>
+        </w:tc>
+        <w:tc>
+          <w:tcPr>
+            <w:tcW w:type="dxa" w:w="1134"/>
+          </w:tcPr>
+          <w:p>
+            <w:pPr>
+              <w:jc w:val="center"/>
+            </w:pPr>
+            <w:r>
+              <w:rPr>
+                <w:rFonts w:ascii="Times New Roman" w:hAnsi="Times New Roman"/>
+                <w:b w:val="0"/>
+                <w:sz w:val="18"/>
+              </w:rPr>
+              <w:t>42</w:t>
+            </w:r>
+          </w:p>
+        </w:tc>
+        <w:tc>
+          <w:tcPr>
+            <w:tcW w:type="dxa" w:w="1701"/>
+          </w:tcPr>
+          <w:p>
+            <w:pPr>
+              <w:jc w:val="left"/>
+            </w:pPr>
+            <w:r>
+              <w:rPr>
+                <w:rFonts w:ascii="Times New Roman" w:hAnsi="Times New Roman"/>
+                <w:b w:val="0"/>
+                <w:sz w:val="18"/>
+              </w:rPr>
+              <w:t>лоток</w:t>
+            </w:r>
+          </w:p>
+        </w:tc>
+        <w:tc>
+          <w:tcPr>
+            <w:tcW w:type="dxa" w:w="850"/>
+          </w:tcPr>
+          <w:p>
+            <w:pPr>
+              <w:jc w:val="center"/>
+            </w:pPr>
+            <w:r>
+              <w:rPr>
+                <w:rFonts w:ascii="Times New Roman" w:hAnsi="Times New Roman"/>
+                <w:b w:val="0"/>
+                <w:sz w:val="18"/>
+              </w:rPr>
+              <w:t>16</w:t>
+            </w:r>
+          </w:p>
+        </w:tc>
+        <w:tc>
+          <w:tcPr>
+            <w:tcW w:type="dxa" w:w="850"/>
+          </w:tcPr>
+          <w:p>
+            <w:pPr>
+              <w:jc w:val="center"/>
+            </w:pPr>
+            <w:r>
+              <w:rPr>
+                <w:rFonts w:ascii="Times New Roman" w:hAnsi="Times New Roman"/>
+                <w:b w:val="0"/>
+                <w:sz w:val="18"/>
+              </w:rPr>
+              <w:t>2.91</w:t>
+            </w:r>
+          </w:p>
+        </w:tc>
+        <w:tc>
+          <w:tcPr>
+            <w:tcW w:type="dxa" w:w="2268"/>
+          </w:tcPr>
+          <w:p>
+            <w:pPr>
+              <w:jc w:val="left"/>
+            </w:pPr>
+            <w:r>
+              <w:rPr>
+                <w:rFonts w:ascii="Times New Roman" w:hAnsi="Times New Roman"/>
+                <w:b w:val="0"/>
+                <w:sz w:val="18"/>
+              </w:rPr>
+              <w:t>план 35м + запас 20%</w:t>
+            </w:r>
+          </w:p>
+        </w:tc>
+      </w:tr>
+      <w:tr>
+        <w:tc>
+          <w:tcPr>
+            <w:tcW w:type="dxa" w:w="397"/>
+          </w:tcPr>
+          <w:p>
+            <w:pPr>
+              <w:jc w:val="center"/>
+            </w:pPr>
+            <w:r>
+              <w:rPr>
+                <w:rFonts w:ascii="Times New Roman" w:hAnsi="Times New Roman"/>
+                <w:b w:val="0"/>
+                <w:sz w:val="18"/>
+              </w:rPr>
+              <w:t>19</w:t>
+            </w:r>
+          </w:p>
+        </w:tc>
+        <w:tc>
+          <w:tcPr>
+            <w:tcW w:type="dxa" w:w="1417"/>
+          </w:tcPr>
+          <w:p>
+            <w:pPr>
+              <w:jc w:val="center"/>
+            </w:pPr>
+            <w:r>
+              <w:rPr>
+                <w:rFonts w:ascii="Times New Roman" w:hAnsi="Times New Roman"/>
+                <w:b w:val="0"/>
+                <w:sz w:val="18"/>
+              </w:rPr>
+              <w:t>—</w:t>
+            </w:r>
+          </w:p>
+        </w:tc>
+        <w:tc>
+          <w:tcPr>
+            <w:tcW w:type="dxa" w:w="1814"/>
+          </w:tcPr>
+          <w:p>
+            <w:pPr>
+              <w:jc w:val="left"/>
+            </w:pPr>
+            <w:r>
+              <w:rPr>
+                <w:rFonts w:ascii="Times New Roman" w:hAnsi="Times New Roman"/>
+                <w:b w:val="0"/>
+                <w:sz w:val="18"/>
+              </w:rPr>
+              <w:t>ВВГнг-FRLS</w:t>
+            </w:r>
+          </w:p>
+        </w:tc>
+        <w:tc>
+          <w:tcPr>
+            <w:tcW w:type="dxa" w:w="1417"/>
+          </w:tcPr>
+          <w:p>
+            <w:pPr>
+              <w:jc w:val="center"/>
+            </w:pPr>
+            <w:r>
+              <w:rPr>
+                <w:rFonts w:ascii="Times New Roman" w:hAnsi="Times New Roman"/>
+                <w:b w:val="0"/>
+                <w:sz w:val="18"/>
+              </w:rPr>
+              <w:t>4×1.5</w:t>
+            </w:r>
+          </w:p>
+        </w:tc>
+        <w:tc>
+          <w:tcPr>
+            <w:tcW w:type="dxa" w:w="1984"/>
+          </w:tcPr>
+          <w:p>
+            <w:pPr>
+              <w:jc w:val="center"/>
+            </w:pPr>
+            <w:r>
+              <w:rPr>
+                <w:rFonts w:ascii="Times New Roman" w:hAnsi="Times New Roman"/>
+                <w:b w:val="0"/>
+                <w:sz w:val="18"/>
+              </w:rPr>
+              <w:t>ЩДУ-1</w:t>
+            </w:r>
+          </w:p>
+        </w:tc>
+        <w:tc>
+          <w:tcPr>
+            <w:tcW w:type="dxa" w:w="3118"/>
+          </w:tcPr>
+          <w:p>
+            <w:pPr>
+              <w:jc w:val="left"/>
+            </w:pPr>
+            <w:r>
+              <w:rPr>
+                <w:rFonts w:ascii="Times New Roman" w:hAnsi="Times New Roman"/>
+                <w:b w:val="0"/>
+                <w:sz w:val="18"/>
+              </w:rPr>
+              <w:t>Вентилятор дымоудаления резервный</w:t>
+            </w:r>
+          </w:p>
+        </w:tc>
+        <w:tc>
+          <w:tcPr>
+            <w:tcW w:type="dxa" w:w="1134"/>
+          </w:tcPr>
+          <w:p>
+            <w:pPr>
+              <w:jc w:val="center"/>
+            </w:pPr>
+            <w:r>
+              <w:rPr>
+                <w:rFonts w:ascii="Times New Roman" w:hAnsi="Times New Roman"/>
+                <w:b w:val="0"/>
+                <w:sz w:val="18"/>
+              </w:rPr>
+              <w:t>35</w:t>
+            </w:r>
+          </w:p>
+        </w:tc>
+        <w:tc>
+          <w:tcPr>
+            <w:tcW w:type="dxa" w:w="1134"/>
+          </w:tcPr>
+          <w:p>
+            <w:pPr>
+              <w:jc w:val="center"/>
+            </w:pPr>
+            <w:r>
+              <w:rPr>
+                <w:rFonts w:ascii="Times New Roman" w:hAnsi="Times New Roman"/>
+                <w:b w:val="0"/>
+                <w:sz w:val="18"/>
+              </w:rPr>
+              <w:t>42</w:t>
+            </w:r>
+          </w:p>
+        </w:tc>
+        <w:tc>
+          <w:tcPr>
+            <w:tcW w:type="dxa" w:w="1701"/>
+          </w:tcPr>
+          <w:p>
+            <w:pPr>
+              <w:jc w:val="left"/>
+            </w:pPr>
+            <w:r>
+              <w:rPr>
+                <w:rFonts w:ascii="Times New Roman" w:hAnsi="Times New Roman"/>
+                <w:b w:val="0"/>
+                <w:sz w:val="18"/>
+              </w:rPr>
+              <w:t>лоток</w:t>
+            </w:r>
+          </w:p>
+        </w:tc>
+        <w:tc>
+          <w:tcPr>
+            <w:tcW w:type="dxa" w:w="850"/>
+          </w:tcPr>
+          <w:p>
+            <w:pPr>
+              <w:jc w:val="center"/>
+            </w:pPr>
+            <w:r>
+              <w:rPr>
+                <w:rFonts w:ascii="Times New Roman" w:hAnsi="Times New Roman"/>
+                <w:b w:val="0"/>
+                <w:sz w:val="18"/>
+              </w:rPr>
+              <w:t>16</w:t>
+            </w:r>
+          </w:p>
+        </w:tc>
+        <w:tc>
+          <w:tcPr>
+            <w:tcW w:type="dxa" w:w="850"/>
+          </w:tcPr>
+          <w:p>
+            <w:pPr>
+              <w:jc w:val="center"/>
+            </w:pPr>
+            <w:r>
+              <w:rPr>
+                <w:rFonts w:ascii="Times New Roman" w:hAnsi="Times New Roman"/>
+                <w:b w:val="0"/>
+                <w:sz w:val="18"/>
+              </w:rPr>
+              <w:t>2.91</w:t>
+            </w:r>
+          </w:p>
+        </w:tc>
+        <w:tc>
+          <w:tcPr>
+            <w:tcW w:type="dxa" w:w="2268"/>
+          </w:tcPr>
+          <w:p>
+            <w:pPr>
+              <w:jc w:val="left"/>
+            </w:pPr>
+            <w:r>
+              <w:rPr>
+                <w:rFonts w:ascii="Times New Roman" w:hAnsi="Times New Roman"/>
+                <w:b w:val="0"/>
+                <w:sz w:val="18"/>
+              </w:rPr>
+              <w:t>резерв; план 35м + запас 20%</w:t>
+            </w:r>
+          </w:p>
+        </w:tc>
+      </w:tr>
+    </w:tbl>
+    <w:p/>
+    <w:p>
+      <w:pPr>
+        <w:jc w:val="left"/>
+      </w:pPr>
+      <w:r>
+        <w:rPr>
+          <w:rFonts w:ascii="Times New Roman" w:hAnsi="Times New Roman"/>
+          <w:sz w:val="20"/>
+        </w:rPr>
+        <w:t>Итого кабельных линий: 19 шт.  |  Длина по плану: 560 м  |  Расчётная длина (с запасом): 626 м</w:t>
+      </w:r>
+    </w:p>
+    <w:p/>
+    <w:tbl>
+      <w:tblPr>
+        <w:tblStyle w:val="TableGrid"/>
+        <w:tblW w:type="auto" w:w="0"/>
+        <w:tblLook w:firstColumn="1" w:firstRow="1" w:lastColumn="0" w:lastRow="0" w:noHBand="0" w:noVBand="1" w:val="04A0"/>
+      </w:tblPr>
+      <w:tblGrid>
+        <w:gridCol w:w="5527"/>
+        <w:gridCol w:w="5527"/>
+        <w:gridCol w:w="5527"/>
+        <w:gridCol w:w="5527"/>
+      </w:tblGrid>
+      <w:tr>
+        <w:tc>
+          <w:tcPr>
+            <w:tcW w:type="dxa" w:w="2268"/>
+          </w:tcPr>
+          <w:p>
+            <w:pPr>
+              <w:jc w:val="center"/>
+            </w:pPr>
+            <w:r>
+              <w:rPr>
+                <w:rFonts w:ascii="Times New Roman" w:hAnsi="Times New Roman"/>
+                <w:b/>
+                <w:sz w:val="18"/>
+              </w:rPr>
+              <w:t>Должность</w:t>
+            </w:r>
+          </w:p>
+        </w:tc>
+        <w:tc>
+          <w:tcPr>
+            <w:tcW w:type="dxa" w:w="3118"/>
+          </w:tcPr>
+          <w:p>
+            <w:pPr>
+              <w:jc w:val="center"/>
+            </w:pPr>
+            <w:r>
+              <w:rPr>
+                <w:rFonts w:ascii="Times New Roman" w:hAnsi="Times New Roman"/>
+                <w:b/>
+                <w:sz w:val="18"/>
+              </w:rPr>
+              <w:t>Фамилия И.О.</w:t>
             </w:r>
           </w:p>
         </w:tc>
@@ -1693,15 +4629,16 @@
             <w:r>
               <w:rPr>
                 <w:rFonts w:ascii="Times New Roman" w:hAnsi="Times New Roman"/>
+                <w:b/>
                 <w:sz w:val="18"/>
               </w:rPr>
-              <w:t>ЩК-1</w:t>
+              <w:t>Подпись</w:t>
             </w:r>
           </w:p>
         </w:tc>
         <w:tc>
           <w:tcPr>
-            <w:tcW w:type="dxa" w:w="1701"/>
+            <w:tcW w:type="dxa" w:w="1417"/>
           </w:tcPr>
           <w:p>
             <w:pPr>
@@ -1710,83 +4647,215 @@
             <w:r>
               <w:rPr>
                 <w:rFonts w:ascii="Times New Roman" w:hAnsi="Times New Roman"/>
+                <w:b/>
                 <w:sz w:val="18"/>
               </w:rPr>
-              <w:t>КД-01</w:t>
+              <w:t>Дата</w:t>
+            </w:r>
+          </w:p>
+        </w:tc>
+      </w:tr>
+      <w:tr>
+        <w:tc>
+          <w:tcPr>
+            <w:tcW w:type="dxa" w:w="5527"/>
+          </w:tcPr>
+          <w:p>
+            <w:pPr>
+              <w:jc w:val="left"/>
+            </w:pPr>
+            <w:r>
+              <w:rPr>
+                <w:rFonts w:ascii="Times New Roman" w:hAnsi="Times New Roman"/>
+                <w:b w:val="0"/>
+                <w:sz w:val="18"/>
+              </w:rPr>
+              <w:t>Разработал</w:t>
             </w:r>
           </w:p>
         </w:tc>
         <w:tc>
           <w:tcPr>
-            <w:tcW w:type="dxa" w:w="1134"/>
+            <w:tcW w:type="dxa" w:w="5527"/>
           </w:tcPr>
           <w:p>
             <w:pPr>
-              <w:jc w:val="center"/>
+              <w:jc w:val="left"/>
             </w:pPr>
             <w:r>
               <w:rPr>
                 <w:rFonts w:ascii="Times New Roman" w:hAnsi="Times New Roman"/>
+                <w:b w:val="0"/>
                 <w:sz w:val="18"/>
               </w:rPr>
-              <w:t>40</w:t>
+              <w:t>Иванов И.И.</w:t>
             </w:r>
           </w:p>
         </w:tc>
         <w:tc>
           <w:tcPr>
-            <w:tcW w:type="dxa" w:w="1984"/>
+            <w:tcW w:type="dxa" w:w="5527"/>
+          </w:tcPr>
+          <w:p/>
+        </w:tc>
+        <w:tc>
+          <w:tcPr>
+            <w:tcW w:type="dxa" w:w="5527"/>
+          </w:tcPr>
+          <w:p/>
+        </w:tc>
+      </w:tr>
+      <w:tr>
+        <w:tc>
+          <w:tcPr>
+            <w:tcW w:type="dxa" w:w="5527"/>
           </w:tcPr>
           <w:p>
             <w:pPr>
-              <w:jc w:val="center"/>
+              <w:jc w:val="left"/>
             </w:pPr>
             <w:r>
               <w:rPr>
                 <w:rFonts w:ascii="Times New Roman" w:hAnsi="Times New Roman"/>
+                <w:b w:val="0"/>
                 <w:sz w:val="18"/>
               </w:rPr>
-              <w:t>лоток</w:t>
+              <w:t>Проверил</w:t>
             </w:r>
           </w:p>
         </w:tc>
         <w:tc>
           <w:tcPr>
-            <w:tcW w:type="dxa" w:w="2835"/>
+            <w:tcW w:type="dxa" w:w="5527"/>
           </w:tcPr>
           <w:p>
             <w:pPr>
-              <w:jc w:val="center"/>
+              <w:jc w:val="left"/>
             </w:pPr>
             <w:r>
               <w:rPr>
                 <w:rFonts w:ascii="Times New Roman" w:hAnsi="Times New Roman"/>
+                <w:b w:val="0"/>
                 <w:sz w:val="18"/>
               </w:rPr>
-              <w:t>Кондиционеры и вентиляция</w:t>
+              <w:t>Петров П.П.</w:t>
             </w:r>
           </w:p>
         </w:tc>
+        <w:tc>
+          <w:tcPr>
+            <w:tcW w:type="dxa" w:w="5527"/>
+          </w:tcPr>
+          <w:p/>
+        </w:tc>
+        <w:tc>
+          <w:tcPr>
+            <w:tcW w:type="dxa" w:w="5527"/>
+          </w:tcPr>
+          <w:p/>
+        </w:tc>
+      </w:tr>
+      <w:tr>
+        <w:tc>
+          <w:tcPr>
+            <w:tcW w:type="dxa" w:w="5527"/>
+          </w:tcPr>
+          <w:p>
+            <w:pPr>
+              <w:jc w:val="left"/>
+            </w:pPr>
+            <w:r>
+              <w:rPr>
+                <w:rFonts w:ascii="Times New Roman" w:hAnsi="Times New Roman"/>
+                <w:b w:val="0"/>
+                <w:sz w:val="18"/>
+              </w:rPr>
+              <w:t>Нормоконтроль</w:t>
+            </w:r>
+          </w:p>
+        </w:tc>
+        <w:tc>
+          <w:tcPr>
+            <w:tcW w:type="dxa" w:w="5527"/>
+          </w:tcPr>
+          <w:p>
+            <w:pPr>
+              <w:jc w:val="left"/>
+            </w:pPr>
+            <w:r>
+              <w:rPr>
+                <w:rFonts w:ascii="Times New Roman" w:hAnsi="Times New Roman"/>
+                <w:b w:val="0"/>
+                <w:sz w:val="18"/>
+              </w:rPr>
+              <w:t>Сидоров С.С.</w:t>
+            </w:r>
+          </w:p>
+        </w:tc>
+        <w:tc>
+          <w:tcPr>
+            <w:tcW w:type="dxa" w:w="5527"/>
+          </w:tcPr>
+          <w:p/>
+        </w:tc>
+        <w:tc>
+          <w:tcPr>
+            <w:tcW w:type="dxa" w:w="5527"/>
+          </w:tcPr>
+          <w:p/>
+        </w:tc>
+      </w:tr>
+      <w:tr>
+        <w:tc>
+          <w:tcPr>
+            <w:tcW w:type="dxa" w:w="5527"/>
+          </w:tcPr>
+          <w:p>
+            <w:pPr>
+              <w:jc w:val="left"/>
+            </w:pPr>
+            <w:r>
+              <w:rPr>
+                <w:rFonts w:ascii="Times New Roman" w:hAnsi="Times New Roman"/>
+                <w:b w:val="0"/>
+                <w:sz w:val="18"/>
+              </w:rPr>
+              <w:t>ГИП</w:t>
+            </w:r>
+          </w:p>
+        </w:tc>
+        <w:tc>
+          <w:tcPr>
+            <w:tcW w:type="dxa" w:w="5527"/>
+          </w:tcPr>
+          <w:p>
+            <w:pPr>
+              <w:jc w:val="left"/>
+            </w:pPr>
+            <w:r>
+              <w:rPr>
+                <w:rFonts w:ascii="Times New Roman" w:hAnsi="Times New Roman"/>
+                <w:b w:val="0"/>
+                <w:sz w:val="18"/>
+              </w:rPr>
+              <w:t>Козлов К.К.</w:t>
+            </w:r>
+          </w:p>
+        </w:tc>
+        <w:tc>
+          <w:tcPr>
+            <w:tcW w:type="dxa" w:w="5527"/>
+          </w:tcPr>
+          <w:p/>
+        </w:tc>
+        <w:tc>
+          <w:tcPr>
+            <w:tcW w:type="dxa" w:w="5527"/>
+          </w:tcPr>
+          <w:p/>
+        </w:tc>
       </w:tr>
     </w:tbl>
-    <w:p/>
-    <w:p>
-      <w:r>
-        <w:rPr>
-          <w:rFonts w:ascii="Times New Roman" w:hAnsi="Times New Roman"/>
-          <w:sz w:val="20"/>
-        </w:rPr>
-        <w:t>Разработал: Иванов И.И.</w:t>
-        <w:tab/>
-        <w:tab/>
-        <w:tab/>
-        <w:t>Проверил: Петров П.П.</w:t>
-        <w:tab/>
-        <w:tab/>
-        <w:tab/>
-        <w:t>Н.контроль: Сидоров С.С.</w:t>
-      </w:r>
-    </w:p>
     <w:sectPr>
       <w:pgSz w:w="23811" w:h="16838"/>
       <w:pgMar w:top="850" w:right="567" w:bottom="850" w:left="1134" w:header="720" w:footer="720" w:gutter="0"/>

</xml_diff>

<commit_message>
feat(engine): wire up ΔU and КЗ cable checks for all levels
All cable selections now pass three additional criteria:
- ΔU (voltage drop): auto-upgrades section until ΔU ≤ limit (ПУЭ 7.1.67/7.1.60)
- Thermal KZ stability: S_мин = Iкз × √t / C (ПУЭ 1.4.17 / ГОСТ 28249-93)
- Protection sensitivity: Iкз_end ≥ k_мин × Iав (ПУЭ 3.1.8)

Applied to: consumer cables, panel feeder cables, VRU incoming cable.
isc_ka passes through calc_vru → calc_feeder → calc_panel (default 10 кА).

https://claude.ai/code/session_01EUXh9NoaZ7HpixNuaMKahR
</commit_message>
<xml_diff>
--- a/elec-system/projects/DEMO-2025-001_Офисный_центр/docs/DEMO-2025-001_cable_journal.docx
+++ b/elec-system/projects/DEMO-2025-001_Офисный_центр/docs/DEMO-2025-001_cable_journal.docx
@@ -509,7 +509,7 @@
                 <w:b w:val="0"/>
                 <w:sz w:val="18"/>
               </w:rPr>
-              <w:t>—</w:t>
+              <w:t>0.66</w:t>
             </w:r>
           </w:p>
         </w:tc>
@@ -1295,7 +1295,7 @@
                 <w:b w:val="0"/>
                 <w:sz w:val="18"/>
               </w:rPr>
-              <w:t>4×1.5</w:t>
+              <w:t>4×2.5</w:t>
             </w:r>
           </w:p>
         </w:tc>
@@ -1421,7 +1421,7 @@
                 <w:b w:val="0"/>
                 <w:sz w:val="18"/>
               </w:rPr>
-              <w:t>2.36</w:t>
+              <w:t>1.42</w:t>
             </w:r>
           </w:p>
         </w:tc>

</xml_diff>